<commit_message>
Clarify novelty and fix literature review in proposal
</commit_message>
<xml_diff>
--- a/proposal/Research_Proposal_Revamped.docx
+++ b/proposal/Research_Proposal_Revamped.docx
@@ -78,7 +78,7 @@
         <w:t>announcements</w:t>
       </w:r>
       <w:r>
-        <w:t xml:space="preserve">. Research tools that link the two [1], [2], [3] decide mainly by </w:t>
+        <w:t xml:space="preserve">. Research tools that link user reviews to developer updates [1], [2], [3], [4] decide mainly by </w:t>
       </w:r>
       <w:r>
         <w:rPr>
@@ -193,27 +193,7 @@
                 <w:sz w:val="17"/>
                 <w:szCs w:val="17"/>
               </w:rPr>
-              <w:t xml:space="preserve">What it </w:t>
-            </w:r>
-            <w:proofErr w:type="gramStart"/>
-            <w:r>
-              <w:rPr>
-                <w:b/>
-                <w:bCs/>
-                <w:sz w:val="17"/>
-                <w:szCs w:val="17"/>
-              </w:rPr>
-              <w:t>actually tells</w:t>
-            </w:r>
-            <w:proofErr w:type="gramEnd"/>
-            <w:r>
-              <w:rPr>
-                <w:b/>
-                <w:bCs/>
-                <w:sz w:val="17"/>
-                <w:szCs w:val="17"/>
-              </w:rPr>
-              <w:t xml:space="preserve"> the player</w:t>
+              <w:t xml:space="preserve">What it actually tells the player</w:t>
             </w:r>
           </w:p>
         </w:tc>
@@ -315,23 +295,7 @@
                 <w:sz w:val="17"/>
                 <w:szCs w:val="17"/>
               </w:rPr>
-              <w:t xml:space="preserve">The problem is known, but nothing </w:t>
-            </w:r>
-            <w:proofErr w:type="gramStart"/>
-            <w:r>
-              <w:rPr>
-                <w:sz w:val="17"/>
-                <w:szCs w:val="17"/>
-              </w:rPr>
-              <w:t>is</w:t>
-            </w:r>
-            <w:proofErr w:type="gramEnd"/>
-            <w:r>
-              <w:rPr>
-                <w:sz w:val="17"/>
-                <w:szCs w:val="17"/>
-              </w:rPr>
-              <w:t xml:space="preserve"> fixed yet.</w:t>
+              <w:t xml:space="preserve">The problem is known, but nothing is fixed yet.</w:t>
             </w:r>
           </w:p>
         </w:tc>
@@ -439,7 +403,7 @@
         <w:t>Known Issues</w:t>
       </w:r>
       <w:r>
-        <w:t xml:space="preserve"> heading. Matching tools usually cut posts into short passages and often drop the headings [4], so they see the same words with opposite meanings.</w:t>
+        <w:t xml:space="preserve"> heading. Matching tools work on short pieces of text, such as single release note sentences [2], and passage search tools make most of their mistakes when the rest of the document is left out [5]. Without the heading, a tool sees the same words with opposite meanings.</w:t>
       </w:r>
     </w:p>
     <w:p>
@@ -455,15 +419,7 @@
         <w:t>The task.</w:t>
       </w:r>
       <w:r>
-        <w:t xml:space="preserve"> Given a player’s problem report and one passage from an announcement, decide (a) whether the passage is about the same problem and (b) what it says happened to that problem, using the </w:t>
-      </w:r>
-      <w:proofErr w:type="gramStart"/>
-      <w:r>
-        <w:t>five level</w:t>
-      </w:r>
-      <w:proofErr w:type="gramEnd"/>
-      <w:r>
-        <w:t xml:space="preserve"> </w:t>
+        <w:t xml:space="preserve"> Given a player’s problem report and one passage from an announcement, decide (a) whether the passage is about the same problem and (b) what it says happened to that problem, using the five level </w:t>
       </w:r>
       <w:r>
         <w:rPr>
@@ -499,7 +455,7 @@
         <w:t>Why it matters.</w:t>
       </w:r>
       <w:r>
-        <w:t xml:space="preserve"> An overclaim tells players that a problem is gone when it is not. It tells developers that a group of complaints is handled when nothing has shipped. It also makes studies that count every match as “addressed feedback” overstate how responsive developers are.</w:t>
+        <w:t xml:space="preserve"> An overclaim tells players that a problem is gone when it is not. It tells developers that a group of complaints is handled when nothing has shipped. It also makes studies that count every match as “addressed feedback” [4] overstate how responsive developers are.</w:t>
       </w:r>
     </w:p>
     <w:p>
@@ -549,15 +505,7 @@
         <w:jc w:val="both"/>
       </w:pPr>
       <w:r>
-        <w:t xml:space="preserve">Earlier work falls into five areas. Table 2 </w:t>
-      </w:r>
-      <w:proofErr w:type="spellStart"/>
-      <w:r>
-        <w:t>summarises</w:t>
-      </w:r>
-      <w:proofErr w:type="spellEnd"/>
-      <w:r>
-        <w:t xml:space="preserve"> what each area has done and what it leaves open.</w:t>
+        <w:t xml:space="preserve">Earlier work falls into five areas. Table 2 summarises what each area has done, what it leaves open and how our work fills that gap.</w:t>
       </w:r>
     </w:p>
     <w:p>
@@ -571,18 +519,10 @@
           <w:b/>
           <w:bCs/>
         </w:rPr>
-        <w:t xml:space="preserve">Table 2. </w:t>
-      </w:r>
-      <w:r>
-        <w:t xml:space="preserve">Literature review: what earlier work has </w:t>
-      </w:r>
-      <w:proofErr w:type="gramStart"/>
-      <w:r>
-        <w:t>done</w:t>
-      </w:r>
-      <w:proofErr w:type="gramEnd"/>
-      <w:r>
-        <w:t xml:space="preserve"> and what is missing.</w:t>
+        <w:t xml:space="preserve">Table 2.</w:t>
+      </w:r>
+      <w:r>
+        <w:t xml:space="preserve"> Literature review: what earlier work has done, what is missing and what we add.</w:t>
       </w:r>
     </w:p>
     <w:tbl>
@@ -690,7 +630,7 @@
                 <w:sz w:val="17"/>
                 <w:szCs w:val="17"/>
               </w:rPr>
-              <w:t>What is missing</w:t>
+              <w:t>What is missing, and what we add</w:t>
             </w:r>
           </w:p>
         </w:tc>
@@ -736,21 +676,12 @@
             <w:pPr>
               <w:spacing w:line="228" w:lineRule="auto"/>
             </w:pPr>
-            <w:proofErr w:type="spellStart"/>
-            <w:r>
-              <w:rPr>
-                <w:sz w:val="17"/>
-                <w:szCs w:val="17"/>
-              </w:rPr>
-              <w:t>RoseMatcher</w:t>
-            </w:r>
-            <w:proofErr w:type="spellEnd"/>
-            <w:r>
-              <w:rPr>
-                <w:sz w:val="17"/>
-                <w:szCs w:val="17"/>
-              </w:rPr>
-              <w:t xml:space="preserve"> matches app review sentences to release note sentences [1]. Lu et al. track Steam review topics alongside a game’s patches [2], and Lin et al. study why popular Steam games ship urgent updates [5].</w:t>
+            <w:r>
+              <w:rPr>
+                <w:sz w:val="17"/>
+                <w:szCs w:val="17"/>
+              </w:rPr>
+              <w:t xml:space="preserve">CRISTAL links app reviews to code changes [1]. RoseMatcher matches app reviews to release notes [2]; its pilot found that over 60% of automatic matches were about a different problem [6]. DeepMatcher matches app reviews to bug reports [3]. LLM-Cure counts a suggestion as implemented when it appears in a later release note [4].</w:t>
             </w:r>
           </w:p>
         </w:tc>
@@ -773,7 +704,23 @@
                 <w:sz w:val="17"/>
                 <w:szCs w:val="17"/>
               </w:rPr>
-              <w:t>A related match is treated as the end point. No study checks whether the matched note reports a completed fix.</w:t>
+              <w:t xml:space="preserve">Links are checked only for topic: same problem or not. A correct match is then read as “addressed”. </w:t>
+            </w:r>
+            <w:r>
+              <w:rPr>
+                <w:b/>
+                <w:bCs/>
+                <w:sz w:val="17"/>
+                <w:szCs w:val="17"/>
+              </w:rPr>
+              <w:t xml:space="preserve">We</w:t>
+            </w:r>
+            <w:r>
+              <w:rPr>
+                <w:sz w:val="17"/>
+                <w:szCs w:val="17"/>
+              </w:rPr>
+              <w:t xml:space="preserve"> add a second check: does the matched text say the problem was actually fixed?</w:t>
             </w:r>
           </w:p>
         </w:tc>
@@ -796,21 +743,12 @@
             <w:pPr>
               <w:spacing w:line="228" w:lineRule="auto"/>
             </w:pPr>
-            <w:proofErr w:type="spellStart"/>
-            <w:r>
-              <w:rPr>
-                <w:sz w:val="17"/>
-                <w:szCs w:val="17"/>
-              </w:rPr>
-              <w:t>Analysing</w:t>
-            </w:r>
-            <w:proofErr w:type="spellEnd"/>
-            <w:r>
-              <w:rPr>
-                <w:sz w:val="17"/>
-                <w:szCs w:val="17"/>
-              </w:rPr>
-              <w:t xml:space="preserve"> release and patch notes</w:t>
+            <w:r>
+              <w:rPr>
+                <w:sz w:val="17"/>
+                <w:szCs w:val="17"/>
+              </w:rPr>
+              <w:t xml:space="preserve">Game updates and release notes</w:t>
             </w:r>
           </w:p>
         </w:tc>
@@ -833,7 +771,7 @@
                 <w:sz w:val="17"/>
                 <w:szCs w:val="17"/>
               </w:rPr>
-              <w:t>Abebe et al. classify what software release notes contain [6]. Truelove et al. study bug fixes in game update notes, including notes that refer to past or future work [7].</w:t>
+              <w:t xml:space="preserve">Lin et al. study Steam reviews [7] and urgent game updates [8]. Lu et al. compare review topics with a game’s patches over time [9]. Truelove et al. sort 12,122 bug fixes from Steam update notes by bug type [10]. Abebe et al. study what release notes contain [11], and Wu et al. find that 64.5% of GitHub release notes group changes under headings [12].</w:t>
             </w:r>
           </w:p>
         </w:tc>
@@ -856,7 +794,23 @@
                 <w:sz w:val="17"/>
                 <w:szCs w:val="17"/>
               </w:rPr>
-              <w:t>Notes are studied on their own, not linked to player complaints, and the scope of a fix (test branch, one platform, workaround) is not labelled.</w:t>
+              <w:t xml:space="preserve">Every listed fix is taken as done, and known issues and test branch fixes are not separated. </w:t>
+            </w:r>
+            <w:r>
+              <w:rPr>
+                <w:b/>
+                <w:bCs/>
+                <w:sz w:val="17"/>
+                <w:szCs w:val="17"/>
+              </w:rPr>
+              <w:t xml:space="preserve">We</w:t>
+            </w:r>
+            <w:r>
+              <w:rPr>
+                <w:sz w:val="17"/>
+                <w:szCs w:val="17"/>
+              </w:rPr>
+              <w:t xml:space="preserve"> link single reviews to single bullets and label each bullet’s status and scope, using its heading and post title.</w:t>
             </w:r>
           </w:p>
         </w:tc>
@@ -908,7 +862,7 @@
                 <w:sz w:val="17"/>
                 <w:szCs w:val="17"/>
               </w:rPr>
-              <w:t>DAPR shows that passages lose meaning when their document context is dropped [4]. Wang et al. check software feedback against retrieved evidence and refuse to answer when it is not supported [3]. Selective prediction lets a model abstain when it is unsure [8].</w:t>
+              <w:t xml:space="preserve">DAPR finds that most passage search errors come from missing document context [5]. Decontextualization rewrites a sentence so that it stands alone [13]. Wang et al. check software feedback against retrieved evidence and refuse to answer when the evidence is weak [14]. Selective prediction lets a model abstain when it is unsure [15].</w:t>
             </w:r>
           </w:p>
         </w:tc>
@@ -931,39 +885,23 @@
                 <w:sz w:val="17"/>
                 <w:szCs w:val="17"/>
               </w:rPr>
-              <w:t xml:space="preserve">Context is used to </w:t>
-            </w:r>
-            <w:r>
-              <w:rPr>
-                <w:i/>
-                <w:iCs/>
-                <w:sz w:val="17"/>
-                <w:szCs w:val="17"/>
-              </w:rPr>
-              <w:t>find</w:t>
-            </w:r>
-            <w:r>
-              <w:rPr>
-                <w:sz w:val="17"/>
-                <w:szCs w:val="17"/>
-              </w:rPr>
-              <w:t xml:space="preserve"> passages, not to read their </w:t>
-            </w:r>
-            <w:r>
-              <w:rPr>
-                <w:i/>
-                <w:iCs/>
-                <w:sz w:val="17"/>
-                <w:szCs w:val="17"/>
-              </w:rPr>
-              <w:t>status</w:t>
-            </w:r>
-            <w:r>
-              <w:rPr>
-                <w:sz w:val="17"/>
-                <w:szCs w:val="17"/>
-              </w:rPr>
-              <w:t>. No study measures how often a match is wrongly read as a fix.</w:t>
+              <w:t xml:space="preserve">Context is used to find passages, not to read their status. </w:t>
+            </w:r>
+            <w:r>
+              <w:rPr>
+                <w:b/>
+                <w:bCs/>
+                <w:sz w:val="17"/>
+                <w:szCs w:val="17"/>
+              </w:rPr>
+              <w:t xml:space="preserve">We</w:t>
+            </w:r>
+            <w:r>
+              <w:rPr>
+                <w:sz w:val="17"/>
+                <w:szCs w:val="17"/>
+              </w:rPr>
+              <w:t xml:space="preserve"> use the heading and title to read the status, and measure how often a match is wrongly read as a fix.</w:t>
             </w:r>
           </w:p>
         </w:tc>
@@ -991,7 +929,7 @@
                 <w:sz w:val="17"/>
                 <w:szCs w:val="17"/>
               </w:rPr>
-              <w:t>Detecting promises and commitments</w:t>
+              <w:t xml:space="preserve">Labelling the status of a statement</w:t>
             </w:r>
           </w:p>
         </w:tc>
@@ -1009,21 +947,12 @@
             <w:pPr>
               <w:spacing w:line="228" w:lineRule="auto"/>
             </w:pPr>
-            <w:proofErr w:type="spellStart"/>
-            <w:r>
-              <w:rPr>
-                <w:sz w:val="17"/>
-                <w:szCs w:val="17"/>
-              </w:rPr>
-              <w:t>PromiseEval</w:t>
-            </w:r>
-            <w:proofErr w:type="spellEnd"/>
-            <w:r>
-              <w:rPr>
-                <w:sz w:val="17"/>
-                <w:szCs w:val="17"/>
-              </w:rPr>
-              <w:t xml:space="preserve"> detects promises in company reports and checks whether evidence supports them [9].</w:t>
+            <w:r>
+              <w:rPr>
+                <w:sz w:val="17"/>
+                <w:szCs w:val="17"/>
+              </w:rPr>
+              <w:t xml:space="preserve">FactBank labels whether a text presents an event as certain, possible or not happening [16]. Clinical text tools label whether a condition is present, absent or only possible [17], often from cue words such as “no” or “history of” [18]. PromiseEval detects promises in company reports and the evidence for them [19].</w:t>
             </w:r>
           </w:p>
         </w:tc>
@@ -1046,7 +975,23 @@
                 <w:sz w:val="17"/>
                 <w:szCs w:val="17"/>
               </w:rPr>
-              <w:t>Not applied to game announcements, player complaints or document headings.</w:t>
+              <w:t xml:space="preserve">Not used for developer fix statements, and no idea of “fixed only on a test branch or one platform”. </w:t>
+            </w:r>
+            <w:r>
+              <w:rPr>
+                <w:b/>
+                <w:bCs/>
+                <w:sz w:val="17"/>
+                <w:szCs w:val="17"/>
+              </w:rPr>
+              <w:t xml:space="preserve">We</w:t>
+            </w:r>
+            <w:r>
+              <w:rPr>
+                <w:sz w:val="17"/>
+                <w:szCs w:val="17"/>
+              </w:rPr>
+              <w:t xml:space="preserve"> apply status labels to fix statements, add scope, and label the review and post as a pair.</w:t>
             </w:r>
           </w:p>
         </w:tc>
@@ -1097,23 +1042,7 @@
                 <w:sz w:val="17"/>
                 <w:szCs w:val="17"/>
               </w:rPr>
-              <w:t xml:space="preserve">Contrast sets [10] and </w:t>
-            </w:r>
-            <w:proofErr w:type="spellStart"/>
-            <w:r>
-              <w:rPr>
-                <w:sz w:val="17"/>
-                <w:szCs w:val="17"/>
-              </w:rPr>
-              <w:t>behavioural</w:t>
-            </w:r>
-            <w:proofErr w:type="spellEnd"/>
-            <w:r>
-              <w:rPr>
-                <w:sz w:val="17"/>
-                <w:szCs w:val="17"/>
-              </w:rPr>
-              <w:t xml:space="preserve"> tests [11] make small edits that should, or should not, change a model’s answer.</w:t>
+              <w:t xml:space="preserve">Contrast sets [20] and behavioural tests [21] make small edits that should, or should not, change a model’s answer.</w:t>
             </w:r>
           </w:p>
         </w:tc>
@@ -1136,23 +1065,23 @@
                 <w:sz w:val="17"/>
                 <w:szCs w:val="17"/>
               </w:rPr>
-              <w:t xml:space="preserve">Not used for </w:t>
-            </w:r>
-            <w:proofErr w:type="gramStart"/>
-            <w:r>
-              <w:rPr>
-                <w:sz w:val="17"/>
-                <w:szCs w:val="17"/>
-              </w:rPr>
-              <w:t>fix</w:t>
-            </w:r>
-            <w:proofErr w:type="gramEnd"/>
-            <w:r>
-              <w:rPr>
-                <w:sz w:val="17"/>
-                <w:szCs w:val="17"/>
-              </w:rPr>
-              <w:t xml:space="preserve"> status, or for headings that flip the meaning of a passage.</w:t>
+              <w:t xml:space="preserve">Not used for fix status. </w:t>
+            </w:r>
+            <w:r>
+              <w:rPr>
+                <w:b/>
+                <w:bCs/>
+                <w:sz w:val="17"/>
+                <w:szCs w:val="17"/>
+              </w:rPr>
+              <w:t xml:space="preserve">We</w:t>
+            </w:r>
+            <w:r>
+              <w:rPr>
+                <w:sz w:val="17"/>
+                <w:szCs w:val="17"/>
+              </w:rPr>
+              <w:t xml:space="preserve"> build edits that change only the status words, the heading or the scope, plus real pairs where a known issue later appears as fixed.</w:t>
             </w:r>
           </w:p>
         </w:tc>
@@ -1173,80 +1102,76 @@
           <w:b/>
           <w:bCs/>
         </w:rPr>
-        <w:t>The gap we cover.</w:t>
-      </w:r>
-      <w:r>
-        <w:t xml:space="preserve"> Together, earlier work can find the announcement that discusses a player’s problem, but no study we found checks what that announcement says </w:t>
+        <w:t xml:space="preserve">The gap we cover.</w:t>
+      </w:r>
+      <w:r>
+        <w:t xml:space="preserve"> In short, earlier work asks “is this post about the same problem as the review?”, and we ask “does this post actually say the problem is fixed?”. No study we found has asked or measured the second question. Earlier work has measured how often matches are about a different problem (over 60% in [6]), but once a match is about the right problem it is read as a fix [2], [4]. That was reasonable for app stores, where a release note describes a version that has already shipped. Steam posts are different. They list known issues, planned fixes and test branch fixes in the same bullet style as real fixes, and the words that tell them apart are often not in the matched passage but in the heading, the post title or a later post. In our data, 186 of 212 bullets under Known Issues headings do not say “known” or “not fixed” themselves, and 42 known issues later reappear under a fix heading, four with exactly the same words (Section 4.2). A tool that reads only the matched passage cannot tell these apart.</w:t>
+      </w:r>
+    </w:p>
+    <w:p>
+      <w:pPr>
+        <w:spacing w:after="100"/>
+        <w:jc w:val="both"/>
+      </w:pPr>
+      <w:r>
+        <w:rPr>
+          <w:b/>
+          <w:bCs/>
+        </w:rPr>
+        <w:t xml:space="preserve">Our contributions.</w:t>
+      </w:r>
+      <w:r>
+        <w:t xml:space="preserve"> (1) </w:t>
+      </w:r>
+      <w:r>
+        <w:rPr>
+          <w:b/>
+          <w:bCs/>
+        </w:rPr>
+        <w:t xml:space="preserve">A new check on review and post links:</w:t>
+      </w:r>
+      <w:r>
+        <w:t xml:space="preserve"> we label whether the post says the problem was fixed, and measure how often current tools say “fixed” when it was not (RQ1, RQ2). (2) </w:t>
+      </w:r>
+      <w:r>
+        <w:rPr>
+          <w:b/>
+          <w:bCs/>
+        </w:rPr>
+        <w:t xml:space="preserve">Where the answer is written:</w:t>
+      </w:r>
+      <w:r>
+        <w:t xml:space="preserve"> we record whether the deciding words are in the passage, the heading, the title or elsewhere, so we know how often a passage only tool cannot get it right. (3) </w:t>
+      </w:r>
+      <w:r>
+        <w:rPr>
+          <w:b/>
+          <w:bCs/>
+        </w:rPr>
+        <w:t xml:space="preserve">The fix claim ladder and the status flip test:</w:t>
+      </w:r>
+      <w:r>
+        <w:t xml:space="preserve"> five levels from “acknowledged” to “released fix”, including fixes that reach only a test branch or one platform, which existing status labels [16], [17] do not cover; and a test set where only the status changes, including real known-to-fixed pairs. (4) </w:t>
+      </w:r>
+      <w:r>
+        <w:rPr>
+          <w:b/>
+          <w:bCs/>
+        </w:rPr>
+        <w:t xml:space="preserve">A tested correction:</w:t>
+      </w:r>
+      <w:r>
+        <w:t xml:space="preserve"> a model that also reads the heading and title and can answer “not sure”, tested on games it has never seen (RQ3). Giving models more context is not new [5], [13]; testing whether it stops false “fixed” answers is. We call a false “fixed” answer an </w:t>
       </w:r>
       <w:r>
         <w:rPr>
           <w:i/>
           <w:iCs/>
         </w:rPr>
-        <w:t>happened</w:t>
-      </w:r>
-      <w:r>
-        <w:t xml:space="preserve"> to the problem, or measures how often a match is wrongly read as a fix. We address this gap with four contributions: (1) the </w:t>
-      </w:r>
-      <w:r>
-        <w:rPr>
-          <w:b/>
-          <w:bCs/>
-        </w:rPr>
-        <w:t>fix claim ladder</w:t>
-      </w:r>
-      <w:r>
-        <w:t xml:space="preserve">, which separates the </w:t>
-      </w:r>
-      <w:r>
-        <w:rPr>
-          <w:i/>
-          <w:iCs/>
-        </w:rPr>
-        <w:t>status</w:t>
-      </w:r>
-      <w:r>
-        <w:t xml:space="preserve"> of a fix from its </w:t>
-      </w:r>
-      <w:r>
-        <w:rPr>
-          <w:i/>
-          <w:iCs/>
-        </w:rPr>
-        <w:t>scope</w:t>
-      </w:r>
-      <w:r>
-        <w:t xml:space="preserve">; (2) </w:t>
-      </w:r>
-      <w:r>
-        <w:rPr>
-          <w:b/>
-          <w:bCs/>
-        </w:rPr>
-        <w:t>overclaim</w:t>
-      </w:r>
-      <w:r>
-        <w:t xml:space="preserve"> as an error with a direction, so a “fixed” answer for an unfixed problem is counted separately from the opposite mistake; (3) a </w:t>
-      </w:r>
-      <w:r>
-        <w:rPr>
-          <w:b/>
-          <w:bCs/>
-        </w:rPr>
-        <w:t>status flip test</w:t>
-      </w:r>
-      <w:r>
-        <w:t xml:space="preserve"> that edits only the status of real passages; and (4) a test of a </w:t>
-      </w:r>
-      <w:r>
-        <w:rPr>
-          <w:b/>
-          <w:bCs/>
-        </w:rPr>
-        <w:t>context aware correction</w:t>
-      </w:r>
-      <w:r>
-        <w:t xml:space="preserve"> on games that the models never saw. Our review covers the closest papers we found and targeted searches in October 2026; it is a bounded search, not proof that no similar work exists.</w:t>
+        <w:t xml:space="preserve">overclaim</w:t>
+      </w:r>
+      <w:r>
+        <w:t xml:space="preserve"> and use the overclaim rate (one minus the precision of “fixed” answers) as our main measure, because telling players a bug is gone when it is not is the more harmful mistake. Our review covers the closest papers we found and targeted searches in October 2026; it is a bounded search, not proof that no similar work exists.</w:t>
       </w:r>
     </w:p>
     <w:p>
@@ -1426,7 +1351,7 @@
                 <w:sz w:val="17"/>
                 <w:szCs w:val="17"/>
               </w:rPr>
-              <w:t xml:space="preserve"> Build a labelled data set of 500 review and passage pairs (100 pilot, 400 main) with ladder levels and evidence words.</w:t>
+              <w:t xml:space="preserve"> Build a labelled data set of 500 review and passage pairs (100 pilot, 400 main) with ladder levels, evidence words and where those words appear.</w:t>
             </w:r>
           </w:p>
         </w:tc>
@@ -1449,23 +1374,7 @@
                 <w:sz w:val="17"/>
                 <w:szCs w:val="17"/>
               </w:rPr>
-              <w:t xml:space="preserve">RQ1. Among pairs about the same problem, what share are </w:t>
-            </w:r>
-            <w:proofErr w:type="gramStart"/>
-            <w:r>
-              <w:rPr>
-                <w:sz w:val="17"/>
-                <w:szCs w:val="17"/>
-              </w:rPr>
-              <w:t>actually released</w:t>
-            </w:r>
-            <w:proofErr w:type="gramEnd"/>
-            <w:r>
-              <w:rPr>
-                <w:sz w:val="17"/>
-                <w:szCs w:val="17"/>
-              </w:rPr>
-              <w:t xml:space="preserve"> fixes?</w:t>
+              <w:t xml:space="preserve">RQ1. Among pairs about the same problem, what share are actually released fixes, and how many can be decided from the passage alone?</w:t>
             </w:r>
           </w:p>
         </w:tc>
@@ -1488,7 +1397,7 @@
                 <w:sz w:val="17"/>
                 <w:szCs w:val="17"/>
               </w:rPr>
-              <w:t>Annotator agreement κ ≥ 0.6; the share of each ladder level with 95% confidence intervals.</w:t>
+              <w:t>Annotator agreement κ ≥ 0.6; the share of each ladder level, and of pairs whose evidence is outside the passage, with 95% confidence intervals.</w:t>
             </w:r>
           </w:p>
         </w:tc>
@@ -2020,23 +1929,7 @@
                 <w:sz w:val="17"/>
                 <w:szCs w:val="17"/>
               </w:rPr>
-              <w:t xml:space="preserve">Splitting posts into passages that keep their </w:t>
-            </w:r>
-            <w:proofErr w:type="gramStart"/>
-            <w:r>
-              <w:rPr>
-                <w:sz w:val="17"/>
-                <w:szCs w:val="17"/>
-              </w:rPr>
-              <w:t>headings, and</w:t>
-            </w:r>
-            <w:proofErr w:type="gramEnd"/>
-            <w:r>
-              <w:rPr>
-                <w:sz w:val="17"/>
-                <w:szCs w:val="17"/>
-              </w:rPr>
-              <w:t xml:space="preserve"> retrieving candidate passages for each review.</w:t>
+              <w:t xml:space="preserve">Splitting posts into passages that keep their headings, and retrieving candidate passages for each review.</w:t>
             </w:r>
           </w:p>
         </w:tc>
@@ -2087,23 +1980,7 @@
                 <w:sz w:val="17"/>
                 <w:szCs w:val="17"/>
               </w:rPr>
-              <w:t xml:space="preserve">500 human labelled pairs, heading based weak labels, and a </w:t>
-            </w:r>
-            <w:proofErr w:type="gramStart"/>
-            <w:r>
-              <w:rPr>
-                <w:sz w:val="17"/>
-                <w:szCs w:val="17"/>
-              </w:rPr>
-              <w:t>400 item</w:t>
-            </w:r>
-            <w:proofErr w:type="gramEnd"/>
-            <w:r>
-              <w:rPr>
-                <w:sz w:val="17"/>
-                <w:szCs w:val="17"/>
-              </w:rPr>
-              <w:t xml:space="preserve"> status flip set.</w:t>
+              <w:t xml:space="preserve">500 human labelled pairs, heading based weak labels, and a 400 item status flip set.</w:t>
             </w:r>
           </w:p>
         </w:tc>
@@ -2253,8 +2130,6 @@
       </w:r>
       <w:r>
         <w:t xml:space="preserve"> The 30 games were chosen on purpose, and 85% of known issue posts come from three games (Fig. 1), so the results may not hold for all of Steam. With a few hundred labelled pairs, rare ladder levels will have wide </w:t>
-      </w:r>
-      <w:r>
         <w:lastRenderedPageBreak/>
         <w:t xml:space="preserve">confidence intervals. Weak labels taken from headings are noisy, so they are used only for training, never for testing. Our labels describe what the text </w:t>
       </w:r>
@@ -2292,15 +2167,7 @@
         <w:jc w:val="both"/>
       </w:pPr>
       <w:r>
-        <w:t xml:space="preserve">All data comes from Valve’s public review and news APIs [12], [13], collected once as a snapshot on 14 October 2026. Author identifiers are stored as salted hashes, and display names are dropped. Table 5 </w:t>
-      </w:r>
-      <w:proofErr w:type="spellStart"/>
-      <w:r>
-        <w:t>summarises</w:t>
-      </w:r>
-      <w:proofErr w:type="spellEnd"/>
-      <w:r>
-        <w:t xml:space="preserve"> the data.</w:t>
+        <w:t xml:space="preserve">All data comes from Valve’s public review and news APIs [22], [23], collected once as a snapshot on 14 October 2026. Author identifiers are stored as salted hashes, and display names are dropped. Table 5 summarises the data.</w:t>
       </w:r>
     </w:p>
     <w:p>
@@ -2721,23 +2588,7 @@
                 <w:sz w:val="17"/>
                 <w:szCs w:val="17"/>
               </w:rPr>
-              <w:t>Between 1 (</w:t>
-            </w:r>
-            <w:proofErr w:type="spellStart"/>
-            <w:r>
-              <w:rPr>
-                <w:sz w:val="17"/>
-                <w:szCs w:val="17"/>
-              </w:rPr>
-              <w:t>Noita</w:t>
-            </w:r>
-            <w:proofErr w:type="spellEnd"/>
-            <w:r>
-              <w:rPr>
-                <w:sz w:val="17"/>
-                <w:szCs w:val="17"/>
-              </w:rPr>
-              <w:t>) and 300 per game.</w:t>
+              <w:t>Between 1 (Noita) and 300 per game.</w:t>
             </w:r>
           </w:p>
         </w:tc>
@@ -2788,7 +2639,7 @@
                 <w:sz w:val="17"/>
                 <w:szCs w:val="17"/>
               </w:rPr>
-              <w:t>about 5,800</w:t>
+              <w:t>12,630</w:t>
             </w:r>
           </w:p>
         </w:tc>
@@ -2811,7 +2662,7 @@
                 <w:sz w:val="17"/>
                 <w:szCs w:val="17"/>
               </w:rPr>
-              <w:t>In 290 posts from 20 games, under headings such as “Bug Fixes” or “Known Issues”; the source of weak labels (Section 4.4).</w:t>
+              <w:t>In 334 posts from 22 games, under headings such as “Bug Fixes” (12,288), “Known Issues” (212) or “Upcoming” (130); the source of weak labels (Section 4.4).</w:t>
             </w:r>
           </w:p>
         </w:tc>
@@ -2837,15 +2688,7 @@
         <w:jc w:val="both"/>
       </w:pPr>
       <w:r>
-        <w:t xml:space="preserve">A phrase scan of all announcements shows that statuses below a released fix are common (Fig. 1). Known issue phrases such as “known issue” appear in 124 posts from 11 games (ladder level 1). Investigation or future fix phrases such as “investigating” or “next patch” appear in 288 posts from 26 games (levels 1 and 2). Test branch phrases such as “experimental” or “unstable branch” appear in 177 posts from 23 games (level 4). These are automatic counts, not checked labels; for example, “working on” also matches “not working on”. We also read three posts by hand. A Dead by Daylight patch lists its fixes separately from a known issue; an Apex Legends post says a crash on AMD graphics cards is under investigation and suggests a driver rollback; and a Project </w:t>
-      </w:r>
-      <w:proofErr w:type="spellStart"/>
-      <w:r>
-        <w:t>Zomboid</w:t>
-      </w:r>
-      <w:proofErr w:type="spellEnd"/>
-      <w:r>
-        <w:t xml:space="preserve"> fix was released only on its Unstable test branch.</w:t>
+        <w:t xml:space="preserve">A phrase scan of all announcements shows that statuses below a released fix are common (Fig. 1). Known issue phrases such as “known issue” appear in 124 posts from 11 games (ladder level 1). Investigation or future fix phrases such as “investigating” or “next patch” appear in 288 posts from 26 games (levels 1 and 2). Test branch phrases such as “experimental” or “unstable branch” appear in 177 posts from 23 games (level 4). These are automatic counts, not checked labels; for example, “working on” also matches “not working on”. We also read three posts by hand. A Dead by Daylight patch lists its fixes separately from a known issue; an Apex Legends post says a crash on AMD graphics cards is under investigation and suggests a driver rollback; and a Project Zomboid fix was released only on its Unstable test branch.</w:t>
       </w:r>
     </w:p>
     <w:p>
@@ -2910,24 +2753,7 @@
         <w:t xml:space="preserve">Fig. 1. </w:t>
       </w:r>
       <w:r>
-        <w:t xml:space="preserve">Announcements per game that contain each phrase type. Highlighted bars hold 85% of known issue posts. Stardew Valley, Cyberpunk 2077 and </w:t>
-      </w:r>
-      <w:proofErr w:type="spellStart"/>
-      <w:r>
-        <w:t>Noita</w:t>
-      </w:r>
-      <w:proofErr w:type="spellEnd"/>
-      <w:r>
-        <w:t xml:space="preserve"> had no matches.</w:t>
-      </w:r>
-    </w:p>
-    <w:p>
-      <w:pPr>
-        <w:pStyle w:val="Heading2"/>
-      </w:pPr>
-      <w:r>
-        <w:lastRenderedPageBreak/>
-        <w:t>4.3 Labels: the fix claim ladder</w:t>
+        <w:t xml:space="preserve">Announcements per game that contain each phrase type. Highlighted bars hold 85% of known issue posts. Stardew Valley, Cyberpunk 2077 and Noita had no matches.</w:t>
       </w:r>
     </w:p>
     <w:p>
@@ -2937,6 +2763,25 @@
         <w:jc w:val="both"/>
       </w:pPr>
       <w:r>
+        <w:t xml:space="preserve">A heading check gives a second view (scripts/pilot_status_audit.py; rule based, not human labels). We split each post at its headings and gave each bullet the status of its heading. Three patterns show that the status is often not in the passage itself. First, 186 of 212 bullets under Known Issues headings contain no status word, for example “Players are unable to shoot properly while in the air using a jetpack”. Second, 3,282 of 12,288 bullets under fix headings (27%) come from posts whose title marks a test build, such as “42.8.1 UNSTABLE Released”; the bullet says “Fixed …”, but only the title shows that it is level 4. Third, 42 known issues reappear under a fix heading a median of 21 days later; in Helldivers 2 the jetpack bullet above appears again, word for word, under “Resolved Top Priority issues”. We also matched 2,087 reviews that mention bugs or crashes to bullets from the same game with BM25. In the 11 games whose posts hold both released fixes and other statuses, 21% of the top matches were not released fixes, but the median game had only 9% and just four games were above 10%. The problem is real but concentrated in games that post test builds or known issue lists, so we report results per game and by this posting style.</w:t>
+      </w:r>
+    </w:p>
+    <w:p>
+      <w:pPr>
+        <w:pStyle w:val="Heading2"/>
+      </w:pPr>
+      <w:r>
+        <w:lastRenderedPageBreak/>
+        <w:t>4.3 Labels: the fix claim ladder</w:t>
+      </w:r>
+    </w:p>
+    <w:p>
+      <w:pPr>
+        <w:keepNext/>
+        <w:spacing w:after="100"/>
+        <w:jc w:val="both"/>
+      </w:pPr>
+      <w:r>
         <w:t xml:space="preserve">Each pair receives two labels: whether the passage is about the </w:t>
       </w:r>
       <w:r>
@@ -2974,15 +2819,7 @@
         <w:t xml:space="preserve">Table 6. </w:t>
       </w:r>
       <w:r>
-        <w:t xml:space="preserve">The </w:t>
-      </w:r>
-      <w:proofErr w:type="gramStart"/>
-      <w:r>
-        <w:t>fix</w:t>
-      </w:r>
-      <w:proofErr w:type="gramEnd"/>
-      <w:r>
-        <w:t xml:space="preserve"> claim ladder (invented examples).</w:t>
+        <w:t xml:space="preserve">The fix claim ladder (invented examples).</w:t>
       </w:r>
     </w:p>
     <w:tbl>
@@ -3776,7 +3613,7 @@
         <w:t>Labelling rules.</w:t>
       </w:r>
       <w:r>
-        <w:t xml:space="preserve"> Annotators see the post title, the heading and the nearby lines, and copy the exact words that support the label. A passage that holds two statuses, such as “fixed on PC; the console fix is coming”, is split into two claims. Explicit words override the heading, so a Known Issues bullet that says “now fixed” is level 5. Both of us label all 100 pilot pairs and 100 of the main pairs independently. We report Cohen’s κ [14], which measures agreement after removing agreement expected by chance (1 is perfect, 0 is chance), for “same problem”, and weighted κ [15], which gives partial credit to near misses, for the ladder level. If κ is below 0.6, we revise the guide and relabel the pilot. Remaining disagreements are settled by discussion.</w:t>
+        <w:t xml:space="preserve"> Annotators see the post title, the heading and the nearby lines, and copy the exact words that support the label. They also mark where those words are: in the passage, the heading, the post title or elsewhere in the post. A passage that holds two statuses, such as “fixed on PC; the console fix is coming”, is split into two claims. Explicit words override the heading, so a Known Issues bullet that says “now fixed” is level 5. Both of us label all 100 pilot pairs and 100 of the main pairs independently. We report Cohen’s κ [24], which measures agreement after removing agreement expected by chance (1 is perfect, 0 is chance), for “same problem”, and weighted κ [25], which gives partial credit to near misses, for the ladder level. If κ is below 0.6, we revise the guide and relabel the pilot. Remaining disagreements are settled by discussion.</w:t>
       </w:r>
     </w:p>
     <w:p>
@@ -3834,15 +3671,7 @@
         <w:t>weak labels</w:t>
       </w:r>
       <w:r>
-        <w:t xml:space="preserve"> [16]: labels produced automatically by rules instead of by people. Here a bullet takes the status of its heading (for example, bullets under “Known Issues” become level 1). They are free and plentiful but noisy and unbalanced, since most fall under </w:t>
-      </w:r>
-      <w:proofErr w:type="gramStart"/>
-      <w:r>
-        <w:t>fix</w:t>
-      </w:r>
-      <w:proofErr w:type="gramEnd"/>
-      <w:r>
-        <w:t xml:space="preserve"> headings, so we add class weights and edited copies of rare cases. Table 7 shows how each data set is used.</w:t>
+        <w:t xml:space="preserve"> [26]: labels produced automatically by rules instead of by people. Here a bullet takes the status of its heading (for example, bullets under “Known Issues” become level 1), and fix bullets in posts whose title names a test build become level 4. Headings that mix statuses, such as “Resolved known issues”, get their own rule. They are free and plentiful but noisy and unbalanced, since most fall under fix headings, so we add class weights and edited copies of rare cases. Table 7 shows how each data set is used.</w:t>
       </w:r>
     </w:p>
     <w:p>
@@ -4380,21 +4209,12 @@
             <w:pPr>
               <w:spacing w:line="228" w:lineRule="auto"/>
             </w:pPr>
-            <w:proofErr w:type="gramStart"/>
-            <w:r>
-              <w:rPr>
-                <w:sz w:val="17"/>
-                <w:szCs w:val="17"/>
-              </w:rPr>
-              <w:t>Final results</w:t>
-            </w:r>
-            <w:proofErr w:type="gramEnd"/>
-            <w:r>
-              <w:rPr>
-                <w:sz w:val="17"/>
-                <w:szCs w:val="17"/>
-              </w:rPr>
-              <w:t xml:space="preserve"> (RQ1 to RQ3)</w:t>
+            <w:r>
+              <w:rPr>
+                <w:sz w:val="17"/>
+                <w:szCs w:val="17"/>
+              </w:rPr>
+              <w:t xml:space="preserve">Final results (RQ1 to RQ3)</w:t>
             </w:r>
           </w:p>
         </w:tc>
@@ -4486,21 +4306,12 @@
             <w:pPr>
               <w:spacing w:line="228" w:lineRule="auto"/>
             </w:pPr>
-            <w:proofErr w:type="gramStart"/>
-            <w:r>
-              <w:rPr>
-                <w:sz w:val="17"/>
-                <w:szCs w:val="17"/>
-              </w:rPr>
-              <w:t>Final results</w:t>
-            </w:r>
-            <w:proofErr w:type="gramEnd"/>
-            <w:r>
-              <w:rPr>
-                <w:sz w:val="17"/>
-                <w:szCs w:val="17"/>
-              </w:rPr>
-              <w:t xml:space="preserve"> (RQ4)</w:t>
+            <w:r>
+              <w:rPr>
+                <w:sz w:val="17"/>
+                <w:szCs w:val="17"/>
+              </w:rPr>
+              <w:t xml:space="preserve">Final results (RQ4)</w:t>
             </w:r>
           </w:p>
         </w:tc>
@@ -4555,15 +4366,7 @@
         <w:t>status classifier</w:t>
       </w:r>
       <w:r>
-        <w:t xml:space="preserve"> decides the ladder level. All models are small and use free, </w:t>
-      </w:r>
-      <w:proofErr w:type="gramStart"/>
-      <w:r>
-        <w:t>open source</w:t>
-      </w:r>
-      <w:proofErr w:type="gramEnd"/>
-      <w:r>
-        <w:t xml:space="preserve"> libraries.</w:t>
+        <w:t xml:space="preserve"> decides the ladder level. All models are small and use free, open source libraries.</w:t>
       </w:r>
     </w:p>
     <w:p>
@@ -4591,7 +4394,7 @@
         <w:t>BM25</w:t>
       </w:r>
       <w:r>
-        <w:t xml:space="preserve"> [17] is a keyword ranking function that rewards shared words, especially rare ones such as “inventory”. </w:t>
+        <w:t xml:space="preserve"> [27] is a keyword ranking function that rewards shared words, especially rare ones such as “inventory”. </w:t>
       </w:r>
       <w:r>
         <w:rPr>
@@ -4902,21 +4705,12 @@
             <w:pPr>
               <w:spacing w:line="228" w:lineRule="auto"/>
             </w:pPr>
-            <w:proofErr w:type="gramStart"/>
-            <w:r>
-              <w:rPr>
-                <w:sz w:val="17"/>
-                <w:szCs w:val="17"/>
-              </w:rPr>
-              <w:t>Hand written</w:t>
-            </w:r>
-            <w:proofErr w:type="gramEnd"/>
-            <w:r>
-              <w:rPr>
-                <w:sz w:val="17"/>
-                <w:szCs w:val="17"/>
-              </w:rPr>
-              <w:t xml:space="preserve"> rules map words (“known issue”, “will fix”) and headings (“Bug Fixes”) to ladder levels.</w:t>
+            <w:r>
+              <w:rPr>
+                <w:sz w:val="17"/>
+                <w:szCs w:val="17"/>
+              </w:rPr>
+              <w:t xml:space="preserve">Hand written rules map words (“known issue”, “will fix”) and headings (“Bug Fixes”) to ladder levels.</w:t>
             </w:r>
           </w:p>
         </w:tc>
@@ -5122,15 +4916,7 @@
         <w:jc w:val="both"/>
       </w:pPr>
       <w:r>
-        <w:t xml:space="preserve">For Systems C and </w:t>
-      </w:r>
-      <w:proofErr w:type="gramStart"/>
-      <w:r>
-        <w:t>D</w:t>
-      </w:r>
-      <w:proofErr w:type="gramEnd"/>
-      <w:r>
-        <w:t xml:space="preserve"> we train two model families, so the result does not depend on one kind of model. The first is </w:t>
+        <w:t xml:space="preserve">For Systems C and D we train two model families, so the result does not depend on one kind of model. The first is </w:t>
       </w:r>
       <w:r>
         <w:rPr>
@@ -5140,15 +4926,7 @@
         <w:t>TF-IDF with logistic regression</w:t>
       </w:r>
       <w:r>
-        <w:t xml:space="preserve">: TF-IDF turns text into word and word pair weights that </w:t>
-      </w:r>
-      <w:proofErr w:type="spellStart"/>
-      <w:r>
-        <w:t>favour</w:t>
-      </w:r>
-      <w:proofErr w:type="spellEnd"/>
-      <w:r>
-        <w:t xml:space="preserve"> distinctive words, and logistic regression learns how much each weight points to each level. The second is a </w:t>
+        <w:t xml:space="preserve">: TF-IDF turns text into word and word pair weights that favour distinctive words, and logistic regression learns how much each weight points to each level. The second is a </w:t>
       </w:r>
       <w:r>
         <w:rPr>
@@ -5174,31 +4952,7 @@
         <w:t>Abstention.</w:t>
       </w:r>
       <w:r>
-        <w:t xml:space="preserve"> System D answers “fixed” only when it predicts level 5 with a probability above a threshold; </w:t>
-      </w:r>
-      <w:proofErr w:type="gramStart"/>
-      <w:r>
-        <w:t>otherwise</w:t>
-      </w:r>
-      <w:proofErr w:type="gramEnd"/>
-      <w:r>
-        <w:t xml:space="preserve"> it </w:t>
-      </w:r>
-      <w:proofErr w:type="gramStart"/>
-      <w:r>
-        <w:t>answers</w:t>
-      </w:r>
-      <w:proofErr w:type="gramEnd"/>
-      <w:r>
-        <w:t xml:space="preserve"> “the announcement does not establish a fix”. A higher threshold gives fewer </w:t>
-      </w:r>
-      <w:proofErr w:type="gramStart"/>
-      <w:r>
-        <w:t>overclaims</w:t>
-      </w:r>
-      <w:proofErr w:type="gramEnd"/>
-      <w:r>
-        <w:t xml:space="preserve"> but more cases left unanswered. We show this trade off as a </w:t>
+        <w:t xml:space="preserve"> System D answers “fixed” only when it predicts level 5 with a probability above a threshold; otherwise it answers “the announcement does not establish a fix”. A higher threshold gives fewer overclaims but more cases left unanswered. We show this trade off as a </w:t>
       </w:r>
       <w:r>
         <w:rPr>
@@ -5208,7 +4962,7 @@
         <w:t>risk–coverage curve</w:t>
       </w:r>
       <w:r>
-        <w:t xml:space="preserve"> [8], where </w:t>
+        <w:t xml:space="preserve"> [15], where </w:t>
       </w:r>
       <w:r>
         <w:rPr>
@@ -5246,7 +5000,7 @@
         <w:jc w:val="both"/>
       </w:pPr>
       <w:r>
-        <w:t xml:space="preserve">Following the idea of contrast sets [10], we edit real test passages so that only the status changes (Table 9). A model that only matches topics gives the same answer before and after each edit. We also run </w:t>
+        <w:t xml:space="preserve">Following the idea of contrast sets [20], we edit real test passages so that only the status changes (Table 9). A model that only matches topics gives the same answer before and after each edit. We also run </w:t>
       </w:r>
       <w:r>
         <w:rPr>
@@ -5256,7 +5010,7 @@
         <w:t>invariance checks</w:t>
       </w:r>
       <w:r>
-        <w:t xml:space="preserve"> [11]: renaming the item, for example “inventory” to “map”, must not change the answer. Edits are made from fixed templates and checked by hand.</w:t>
+        <w:t xml:space="preserve"> [21]: renaming the item, for example “inventory” to “map”, must not change the answer. Edits are made from fixed templates and checked by hand. We also add the real known-to-fixed pairs from test games (Section 4.2), where the developer changed the status without any edit by us; they are reported separately.</w:t>
       </w:r>
     </w:p>
     <w:p>
@@ -5978,7 +5732,7 @@
         <w:t>macro F1</w:t>
       </w:r>
       <w:r>
-        <w:t xml:space="preserve"> over the five levels (the average F1 score across levels, so rare levels count as much as common ones), flip accuracy, coverage, and relevance errors from the full pipeline. Pairs from the same game are related, so 95% confidence intervals come from a </w:t>
+        <w:t xml:space="preserve"> over the five levels (the average F1 score across levels, so rare levels count as much as common ones), flip accuracy, coverage, and relevance errors from the full pipeline. Results are also shown per game, and for games that post test builds or known issue lists against those that do not. Pairs from the same game are related, so 95% confidence intervals come from a </w:t>
       </w:r>
       <w:r>
         <w:rPr>
@@ -5988,7 +5742,7 @@
         <w:t>cluster bootstrap</w:t>
       </w:r>
       <w:r>
-        <w:t xml:space="preserve"> that resamples whole games 2,000 times [18]. Systems answer the same pairs, so we compare them with McNemar’s test [19], a test for paired yes or no outcomes, and with a paired bootstrap, using the Holm correction [20] because we make several comparisons. With about 150 “fixed” answers on the test games, an overclaim rate near 20% has a 95% interval of about ±6 points.</w:t>
+        <w:t xml:space="preserve"> that resamples whole games 2,000 times [28]. Systems answer the same pairs, so we compare them with McNemar’s test [29], a test for paired yes or no outcomes, and with a paired bootstrap, using the Holm correction [30] because we make several comparisons. With about 150 “fixed” answers on the test games, an overclaim rate near 20% has a 95% interval of about ±6 points.</w:t>
       </w:r>
     </w:p>
     <w:p>
@@ -6004,31 +5758,7 @@
         <w:t>Success rule, fixed before testing.</w:t>
       </w:r>
       <w:r>
-        <w:t xml:space="preserve"> System D improves on System C if </w:t>
-      </w:r>
-      <w:proofErr w:type="gramStart"/>
-      <w:r>
-        <w:t>its</w:t>
-      </w:r>
-      <w:proofErr w:type="gramEnd"/>
-      <w:r>
-        <w:t xml:space="preserve"> overclaim rate is lower, the 95% interval of the difference does not include zero, and its released fix recall is at most 5 points lower. </w:t>
-      </w:r>
-      <w:proofErr w:type="gramStart"/>
-      <w:r>
-        <w:t>Otherwise</w:t>
-      </w:r>
-      <w:proofErr w:type="gramEnd"/>
-      <w:r>
-        <w:t xml:space="preserve"> we </w:t>
-      </w:r>
-      <w:proofErr w:type="gramStart"/>
-      <w:r>
-        <w:t>report</w:t>
-      </w:r>
-      <w:proofErr w:type="gramEnd"/>
-      <w:r>
-        <w:t xml:space="preserve"> a negative result, which is still useful.</w:t>
+        <w:t xml:space="preserve"> System D improves on System C if its overclaim rate is lower, the 95% interval of the difference does not include zero, and its released fix recall is at most 5 points lower. Otherwise we report a negative result, which is still useful.</w:t>
       </w:r>
     </w:p>
     <w:p>
@@ -6047,32 +5777,15 @@
       <w:r>
         <w:t xml:space="preserve">Fig. 2 shows how data moves through the project. Each stage is a Python script that can be rerun from the saved snapshot (Table 10). All four systems sit behind one function, </w:t>
       </w:r>
-      <w:proofErr w:type="gramStart"/>
       <w:r>
         <w:rPr>
           <w:i/>
           <w:iCs/>
         </w:rPr>
-        <w:t>classify(</w:t>
-      </w:r>
-      <w:proofErr w:type="gramEnd"/>
-      <w:r>
-        <w:rPr>
-          <w:i/>
-          <w:iCs/>
-        </w:rPr>
-        <w:t>report, passage, context)</w:t>
-      </w:r>
-      <w:r>
-        <w:t xml:space="preserve">, which </w:t>
-      </w:r>
-      <w:proofErr w:type="gramStart"/>
-      <w:r>
-        <w:t>returns</w:t>
-      </w:r>
-      <w:proofErr w:type="gramEnd"/>
-      <w:r>
-        <w:t xml:space="preserve"> a ladder level, the supporting words and a plain answer. The API and the evaluation scripts call this same function, so the demo runs exactly the models that we evaluate. A model is promoted to the app only if it beats the current one on the development labels.</w:t>
+        <w:t>classify(report, passage, context)</w:t>
+      </w:r>
+      <w:r>
+        <w:t xml:space="preserve">, which returns a ladder level, the supporting words and a plain answer. The API and the evaluation scripts call this same function, so the demo runs exactly the models that we evaluate. A model is promoted to the app only if it beats the current one on the development labels.</w:t>
       </w:r>
     </w:p>
     <w:p>
@@ -6313,23 +6026,7 @@
                 <w:sz w:val="17"/>
                 <w:szCs w:val="17"/>
               </w:rPr>
-              <w:t xml:space="preserve">Downloads reviews and announcements, resumes after interruptions, and </w:t>
-            </w:r>
-            <w:proofErr w:type="gramStart"/>
-            <w:r>
-              <w:rPr>
-                <w:sz w:val="17"/>
-                <w:szCs w:val="17"/>
-              </w:rPr>
-              <w:t>waits</w:t>
-            </w:r>
-            <w:proofErr w:type="gramEnd"/>
-            <w:r>
-              <w:rPr>
-                <w:sz w:val="17"/>
-                <w:szCs w:val="17"/>
-              </w:rPr>
-              <w:t xml:space="preserve"> 3 seconds between requests.</w:t>
+              <w:t xml:space="preserve">Downloads reviews and announcements, resumes after interruptions, and waits 3 seconds between requests.</w:t>
             </w:r>
           </w:p>
         </w:tc>
@@ -6495,31 +6192,13 @@
             <w:pPr>
               <w:spacing w:line="228" w:lineRule="auto"/>
             </w:pPr>
-            <w:proofErr w:type="spellStart"/>
-            <w:r>
-              <w:rPr>
-                <w:sz w:val="17"/>
-                <w:szCs w:val="17"/>
-              </w:rPr>
-              <w:t>DuckDB</w:t>
-            </w:r>
-            <w:proofErr w:type="spellEnd"/>
-            <w:r>
-              <w:rPr>
-                <w:sz w:val="17"/>
-                <w:szCs w:val="17"/>
-              </w:rPr>
-              <w:t xml:space="preserve">, Parquet, </w:t>
-            </w:r>
-            <w:proofErr w:type="spellStart"/>
-            <w:r>
-              <w:rPr>
-                <w:sz w:val="17"/>
-                <w:szCs w:val="17"/>
-              </w:rPr>
-              <w:t>pandera</w:t>
-            </w:r>
-            <w:proofErr w:type="spellEnd"/>
+            <w:r>
+              <w:rPr>
+                <w:sz w:val="17"/>
+                <w:szCs w:val="17"/>
+              </w:rPr>
+              <w:t xml:space="preserve">DuckDB, Parquet, pandera</w:t>
+            </w:r>
           </w:p>
         </w:tc>
       </w:tr>
@@ -6666,33 +6345,8 @@
                 <w:sz w:val="17"/>
                 <w:szCs w:val="17"/>
               </w:rPr>
-              <w:t xml:space="preserve">scikit-learn, </w:t>
-            </w:r>
-            <w:proofErr w:type="spellStart"/>
-            <w:r>
-              <w:rPr>
-                <w:sz w:val="17"/>
-                <w:szCs w:val="17"/>
-              </w:rPr>
-              <w:t>PyTorch</w:t>
-            </w:r>
-            <w:proofErr w:type="spellEnd"/>
-            <w:r>
-              <w:rPr>
-                <w:sz w:val="17"/>
-                <w:szCs w:val="17"/>
-              </w:rPr>
-              <w:t xml:space="preserve">, Hugging Face Transformers, </w:t>
-            </w:r>
-            <w:proofErr w:type="spellStart"/>
-            <w:r>
-              <w:rPr>
-                <w:sz w:val="17"/>
-                <w:szCs w:val="17"/>
-              </w:rPr>
-              <w:t>MLflow</w:t>
-            </w:r>
-            <w:proofErr w:type="spellEnd"/>
+              <w:t xml:space="preserve">scikit-learn, PyTorch, Hugging Face Transformers, MLflow</w:t>
+            </w:r>
           </w:p>
         </w:tc>
       </w:tr>
@@ -6742,23 +6396,7 @@
                 <w:sz w:val="17"/>
                 <w:szCs w:val="17"/>
               </w:rPr>
-              <w:t xml:space="preserve">Serves </w:t>
-            </w:r>
-            <w:proofErr w:type="gramStart"/>
-            <w:r>
-              <w:rPr>
-                <w:sz w:val="17"/>
-                <w:szCs w:val="17"/>
-              </w:rPr>
-              <w:t>classify(</w:t>
-            </w:r>
-            <w:proofErr w:type="gramEnd"/>
-            <w:r>
-              <w:rPr>
-                <w:sz w:val="17"/>
-                <w:szCs w:val="17"/>
-              </w:rPr>
-              <w:t>) to the user interface (Section 7).</w:t>
+              <w:t xml:space="preserve">Serves classify() to the user interface (Section 7).</w:t>
             </w:r>
           </w:p>
         </w:tc>
@@ -6776,31 +6414,13 @@
             <w:pPr>
               <w:spacing w:line="228" w:lineRule="auto"/>
             </w:pPr>
-            <w:proofErr w:type="spellStart"/>
-            <w:r>
-              <w:rPr>
-                <w:sz w:val="17"/>
-                <w:szCs w:val="17"/>
-              </w:rPr>
-              <w:t>FastAPI</w:t>
-            </w:r>
-            <w:proofErr w:type="spellEnd"/>
-            <w:r>
-              <w:rPr>
-                <w:sz w:val="17"/>
-                <w:szCs w:val="17"/>
-              </w:rPr>
-              <w:t xml:space="preserve">, </w:t>
-            </w:r>
-            <w:proofErr w:type="spellStart"/>
-            <w:r>
-              <w:rPr>
-                <w:sz w:val="17"/>
-                <w:szCs w:val="17"/>
-              </w:rPr>
-              <w:t>Streamlit</w:t>
-            </w:r>
-            <w:proofErr w:type="spellEnd"/>
+            <w:r>
+              <w:rPr>
+                <w:sz w:val="17"/>
+                <w:szCs w:val="17"/>
+              </w:rPr>
+              <w:t xml:space="preserve">FastAPI, Streamlit</w:t>
+            </w:r>
           </w:p>
         </w:tc>
       </w:tr>
@@ -6869,21 +6489,12 @@
             <w:pPr>
               <w:spacing w:line="228" w:lineRule="auto"/>
             </w:pPr>
-            <w:proofErr w:type="spellStart"/>
-            <w:r>
-              <w:rPr>
-                <w:sz w:val="17"/>
-                <w:szCs w:val="17"/>
-              </w:rPr>
-              <w:t>pytest</w:t>
-            </w:r>
-            <w:proofErr w:type="spellEnd"/>
-            <w:r>
-              <w:rPr>
-                <w:sz w:val="17"/>
-                <w:szCs w:val="17"/>
-              </w:rPr>
-              <w:t>, GitHub Actions</w:t>
+            <w:r>
+              <w:rPr>
+                <w:sz w:val="17"/>
+                <w:szCs w:val="17"/>
+              </w:rPr>
+              <w:t>pytest, GitHub Actions</w:t>
             </w:r>
           </w:p>
         </w:tc>
@@ -7124,23 +6735,7 @@
                 <w:sz w:val="17"/>
                 <w:szCs w:val="17"/>
               </w:rPr>
-              <w:t xml:space="preserve">Choose a game and paste a review. The app lists the best matching passages with their heading, date and link. Each passage shows its ladder level as a </w:t>
-            </w:r>
-            <w:proofErr w:type="spellStart"/>
-            <w:r>
-              <w:rPr>
-                <w:sz w:val="17"/>
-                <w:szCs w:val="17"/>
-              </w:rPr>
-              <w:t>coloured</w:t>
-            </w:r>
-            <w:proofErr w:type="spellEnd"/>
-            <w:r>
-              <w:rPr>
-                <w:sz w:val="17"/>
-                <w:szCs w:val="17"/>
-              </w:rPr>
-              <w:t xml:space="preserve"> badge, the highlighted evidence words and a plain answer such as “Fixed in a released update”, “Fixed only on the Unstable branch” or “Not fixed yet: acknowledged”.</w:t>
+              <w:t xml:space="preserve">Choose a game and paste a review. The app lists the best matching passages with their heading, date and link. Each passage shows its ladder level as a coloured badge, the highlighted evidence words and a plain answer such as “Fixed in a released update”, “Fixed only on the Unstable branch” or “Not fixed yet: acknowledged”.</w:t>
             </w:r>
           </w:p>
         </w:tc>
@@ -7471,75 +7066,9 @@
         <w:t>Software.</w:t>
       </w:r>
       <w:r>
-        <w:t xml:space="preserve"> Table 10 lists the tools for each component. All of them are free and open source: Python, pandas, </w:t>
-      </w:r>
-      <w:proofErr w:type="spellStart"/>
-      <w:r>
-        <w:t>DuckDB</w:t>
-      </w:r>
-      <w:proofErr w:type="spellEnd"/>
-      <w:r>
-        <w:t xml:space="preserve">, Parquet and </w:t>
-      </w:r>
-      <w:proofErr w:type="spellStart"/>
-      <w:r>
-        <w:t>pandera</w:t>
-      </w:r>
-      <w:proofErr w:type="spellEnd"/>
-      <w:r>
-        <w:t xml:space="preserve"> for data; rank_bm25 and the sentence-transformers library for retrieval; scikit-learn, </w:t>
-      </w:r>
-      <w:proofErr w:type="spellStart"/>
-      <w:r>
-        <w:t>PyTorch</w:t>
-      </w:r>
-      <w:proofErr w:type="spellEnd"/>
-      <w:r>
-        <w:t xml:space="preserve">, Hugging Face Transformers and </w:t>
-      </w:r>
-      <w:proofErr w:type="spellStart"/>
-      <w:r>
-        <w:t>MLflow</w:t>
-      </w:r>
-      <w:proofErr w:type="spellEnd"/>
-      <w:r>
-        <w:t xml:space="preserve"> for training and model tracking; NumPy, SciPy, </w:t>
-      </w:r>
-      <w:proofErr w:type="spellStart"/>
-      <w:r>
-        <w:t>statsmodels</w:t>
-      </w:r>
-      <w:proofErr w:type="spellEnd"/>
-      <w:r>
-        <w:t xml:space="preserve"> and matplotlib </w:t>
-      </w:r>
-      <w:r>
+        <w:t xml:space="preserve"> Table 10 lists the tools for each component. All of them are free and open source: Python, pandas, DuckDB, Parquet and pandera for data; rank_bm25 and the sentence-transformers library for retrieval; scikit-learn, PyTorch, Hugging Face Transformers and MLflow for training and model tracking; NumPy, SciPy, statsmodels and matplotlib </w:t>
         <w:lastRenderedPageBreak/>
-        <w:t xml:space="preserve">for statistics and figures; </w:t>
-      </w:r>
-      <w:proofErr w:type="spellStart"/>
-      <w:r>
-        <w:t>FastAPI</w:t>
-      </w:r>
-      <w:proofErr w:type="spellEnd"/>
-      <w:r>
-        <w:t xml:space="preserve"> and </w:t>
-      </w:r>
-      <w:proofErr w:type="spellStart"/>
-      <w:r>
-        <w:t>Streamlit</w:t>
-      </w:r>
-      <w:proofErr w:type="spellEnd"/>
-      <w:r>
-        <w:t xml:space="preserve"> for the interface; and Git, GitHub, </w:t>
-      </w:r>
-      <w:proofErr w:type="spellStart"/>
-      <w:r>
-        <w:t>pytest</w:t>
-      </w:r>
-      <w:proofErr w:type="spellEnd"/>
-      <w:r>
-        <w:t xml:space="preserve"> and GitHub Actions for version control and testing. These choices may change as the project develops.</w:t>
+        <w:t xml:space="preserve">for statistics and figures; FastAPI and Streamlit for the interface; and Git, GitHub, pytest and GitHub Actions for version control and testing. These choices may change as the project develops.</w:t>
       </w:r>
     </w:p>
     <w:p>
@@ -7846,7 +7375,7 @@
                 <w:sz w:val="17"/>
                 <w:szCs w:val="17"/>
               </w:rPr>
-              <w:t>Requests are spaced 3 seconds apart, and we follow the Steam Web API terms [21].</w:t>
+              <w:t>Requests are spaced 3 seconds apart, and we follow the Steam Web API terms [31].</w:t>
             </w:r>
           </w:p>
         </w:tc>
@@ -7920,23 +7449,7 @@
                 <w:sz w:val="17"/>
                 <w:szCs w:val="17"/>
               </w:rPr>
-              <w:t xml:space="preserve">We state these limits, keep positive and negative reviews, and report results per game so large games cannot hide failures </w:t>
-            </w:r>
-            <w:proofErr w:type="gramStart"/>
-            <w:r>
-              <w:rPr>
-                <w:sz w:val="17"/>
-                <w:szCs w:val="17"/>
-              </w:rPr>
-              <w:t>on</w:t>
-            </w:r>
-            <w:proofErr w:type="gramEnd"/>
-            <w:r>
-              <w:rPr>
-                <w:sz w:val="17"/>
-                <w:szCs w:val="17"/>
-              </w:rPr>
-              <w:t xml:space="preserve"> small ones.</w:t>
+              <w:t xml:space="preserve">We state these limits, keep positive and negative reviews, and report results per game so large games cannot hide failures on small ones.</w:t>
             </w:r>
           </w:p>
         </w:tc>
@@ -8207,64 +7720,38 @@
           <w:szCs w:val="17"/>
         </w:rPr>
         <w:t>[1]</w:t>
-      </w:r>
+        <w:tab/>
+        <w:t xml:space="preserve">F. Palomba, M. Linares-Vásquez, G. Bavota, R. Oliveto, M. Di Penta, D. Poshyvanyk and A. De Lucia, “User reviews matter! Tracking crowdsourced reviews to support evolution of successful apps,” in Proc. ICSME, 2015, pp. 291–300. </w:t>
+      </w:r>
+      <w:hyperlink r:id="rIdRef1" w:history="1">
+        <w:r>
+          <w:rPr>
+            <w:rStyle w:val="Hyperlink"/>
+            <w:sz w:val="17"/>
+            <w:szCs w:val="17"/>
+          </w:rPr>
+          <w:t>https://doi.org/10.1109/ICSM.2015.7332475</w:t>
+        </w:r>
+      </w:hyperlink>
+    </w:p>
+    <w:p>
+      <w:pPr>
+        <w:tabs>
+          <w:tab w:val="left" w:pos="400"/>
+        </w:tabs>
+        <w:spacing w:after="30" w:line="228" w:lineRule="auto"/>
+        <w:ind w:left="400" w:hanging="400"/>
+      </w:pPr>
       <w:r>
         <w:rPr>
           <w:sz w:val="17"/>
           <w:szCs w:val="17"/>
         </w:rPr>
+        <w:t>[2]</w:t>
         <w:tab/>
-        <w:t xml:space="preserve">T. Liu, C. Wang, K. Huang, P. Liang, B. Zhang, M. </w:t>
-      </w:r>
-      <w:proofErr w:type="spellStart"/>
-      <w:r>
-        <w:rPr>
-          <w:sz w:val="17"/>
-          <w:szCs w:val="17"/>
-        </w:rPr>
-        <w:t>Daneva</w:t>
-      </w:r>
-      <w:proofErr w:type="spellEnd"/>
-      <w:r>
-        <w:rPr>
-          <w:sz w:val="17"/>
-          <w:szCs w:val="17"/>
-        </w:rPr>
-        <w:t xml:space="preserve"> and M. van </w:t>
-      </w:r>
-      <w:proofErr w:type="spellStart"/>
-      <w:r>
-        <w:rPr>
-          <w:sz w:val="17"/>
-          <w:szCs w:val="17"/>
-        </w:rPr>
-        <w:t>Sinderen</w:t>
-      </w:r>
-      <w:proofErr w:type="spellEnd"/>
-      <w:r>
-        <w:rPr>
-          <w:sz w:val="17"/>
-          <w:szCs w:val="17"/>
-        </w:rPr>
-        <w:t>, “</w:t>
-      </w:r>
-      <w:proofErr w:type="spellStart"/>
-      <w:r>
-        <w:rPr>
-          <w:sz w:val="17"/>
-          <w:szCs w:val="17"/>
-        </w:rPr>
-        <w:t>RoseMatcher</w:t>
-      </w:r>
-      <w:proofErr w:type="spellEnd"/>
-      <w:r>
-        <w:rPr>
-          <w:sz w:val="17"/>
-          <w:szCs w:val="17"/>
-        </w:rPr>
-        <w:t xml:space="preserve">: Identifying the impact of user reviews on app updates,” Information and Software Technology, vol. 161, 107261, 2023. </w:t>
-      </w:r>
-      <w:hyperlink r:id="rId10" w:history="1">
+        <w:t xml:space="preserve">T. Liu, C. Wang, K. Huang, P. Liang, B. Zhang, M. Daneva and M. van Sinderen, “RoseMatcher: Identifying the impact of user reviews on app updates,” Information and Software Technology, vol. 161, 107261, 2023. </w:t>
+      </w:r>
+      <w:hyperlink r:id="rIdRef2" w:history="1">
         <w:r>
           <w:rPr>
             <w:rStyle w:val="Hyperlink"/>
@@ -8288,48 +7775,20 @@
           <w:sz w:val="17"/>
           <w:szCs w:val="17"/>
         </w:rPr>
-        <w:t>[2]</w:t>
-      </w:r>
-      <w:r>
-        <w:rPr>
-          <w:sz w:val="17"/>
-          <w:szCs w:val="17"/>
-        </w:rPr>
+        <w:t>[3]</w:t>
         <w:tab/>
-        <w:t xml:space="preserve">C. Lu, X. Li, T. </w:t>
-      </w:r>
-      <w:proofErr w:type="spellStart"/>
-      <w:r>
-        <w:rPr>
-          <w:sz w:val="17"/>
-          <w:szCs w:val="17"/>
-        </w:rPr>
-        <w:t>Nummenmaa</w:t>
-      </w:r>
-      <w:proofErr w:type="spellEnd"/>
-      <w:r>
-        <w:rPr>
-          <w:sz w:val="17"/>
-          <w:szCs w:val="17"/>
-        </w:rPr>
-        <w:t xml:space="preserve">, Z. Zhang and J. Peltonen, “Patches and player community perceptions: Analysis of No Man’s Sky Steam reviews,” in Proc. </w:t>
-      </w:r>
-      <w:proofErr w:type="spellStart"/>
-      <w:r>
-        <w:rPr>
-          <w:sz w:val="17"/>
-          <w:szCs w:val="17"/>
-        </w:rPr>
-        <w:t>DiGRA</w:t>
-      </w:r>
-      <w:proofErr w:type="spellEnd"/>
-      <w:r>
-        <w:rPr>
-          <w:sz w:val="17"/>
-          <w:szCs w:val="17"/>
-        </w:rPr>
-        <w:t>, 2020.</w:t>
-      </w:r>
+        <w:t xml:space="preserve">M. Haering, C. Stanik and W. Maalej, “Automatically matching bug reports with related app reviews,” in Proc. ICSE, 2021, pp. 970–981. </w:t>
+      </w:r>
+      <w:hyperlink r:id="rIdRef3" w:history="1">
+        <w:r>
+          <w:rPr>
+            <w:rStyle w:val="Hyperlink"/>
+            <w:sz w:val="17"/>
+            <w:szCs w:val="17"/>
+          </w:rPr>
+          <w:t>https://doi.org/10.1109/ICSE43902.2021.00092</w:t>
+        </w:r>
+      </w:hyperlink>
     </w:p>
     <w:p>
       <w:pPr>
@@ -8344,17 +7803,291 @@
           <w:sz w:val="17"/>
           <w:szCs w:val="17"/>
         </w:rPr>
-        <w:t>[3]</w:t>
-      </w:r>
+        <w:t>[4]</w:t>
+        <w:tab/>
+        <w:t xml:space="preserve">M. Assi, S. Hassan and Y. Zou, “LLM-Cure: LLM-based competitor user review analysis for feature enhancement,” ACM Transactions on Software Engineering and Methodology, vol. 35, no. 4, 2026. </w:t>
+      </w:r>
+      <w:hyperlink r:id="rIdRef4" w:history="1">
+        <w:r>
+          <w:rPr>
+            <w:rStyle w:val="Hyperlink"/>
+            <w:sz w:val="17"/>
+            <w:szCs w:val="17"/>
+          </w:rPr>
+          <w:t>https://doi.org/10.1145/3744644</w:t>
+        </w:r>
+      </w:hyperlink>
+    </w:p>
+    <w:p>
+      <w:pPr>
+        <w:tabs>
+          <w:tab w:val="left" w:pos="400"/>
+        </w:tabs>
+        <w:spacing w:after="30" w:line="228" w:lineRule="auto"/>
+        <w:ind w:left="400" w:hanging="400"/>
+      </w:pPr>
       <w:r>
         <w:rPr>
           <w:sz w:val="17"/>
           <w:szCs w:val="17"/>
         </w:rPr>
+        <w:t>[5]</w:t>
         <w:tab/>
-        <w:t xml:space="preserve">Wang et al., “From noisy feedback to evidence aware issue specifications,” Automated Software Engineering, 2026. </w:t>
-      </w:r>
-      <w:hyperlink r:id="rId11" w:history="1">
+        <w:t xml:space="preserve">K. Wang, N. Reimers and I. Gurevych, “DAPR: A benchmark on document-aware passage retrieval,” in Proc. ACL, 2024, pp. 4313–4330. </w:t>
+      </w:r>
+      <w:hyperlink r:id="rIdRef5" w:history="1">
+        <w:r>
+          <w:rPr>
+            <w:rStyle w:val="Hyperlink"/>
+            <w:sz w:val="17"/>
+            <w:szCs w:val="17"/>
+          </w:rPr>
+          <w:t>https://aclanthology.org/2024.acl-long.236/</w:t>
+        </w:r>
+      </w:hyperlink>
+    </w:p>
+    <w:p>
+      <w:pPr>
+        <w:tabs>
+          <w:tab w:val="left" w:pos="400"/>
+        </w:tabs>
+        <w:spacing w:after="30" w:line="228" w:lineRule="auto"/>
+        <w:ind w:left="400" w:hanging="400"/>
+      </w:pPr>
+      <w:r>
+        <w:rPr>
+          <w:sz w:val="17"/>
+          <w:szCs w:val="17"/>
+        </w:rPr>
+        <w:t>[6]</w:t>
+        <w:tab/>
+        <w:t xml:space="preserve">C. Wang, T. Liu, P. Liang, M. Daneva and M. van Sinderen, “The role of user reviews in app updates: A preliminary investigation on app release notes,” in Proc. APSEC, 2021, pp. 520–525. </w:t>
+      </w:r>
+      <w:hyperlink r:id="rIdRef6" w:history="1">
+        <w:r>
+          <w:rPr>
+            <w:rStyle w:val="Hyperlink"/>
+            <w:sz w:val="17"/>
+            <w:szCs w:val="17"/>
+          </w:rPr>
+          <w:t>https://doi.org/10.1109/APSEC53868.2021.00061</w:t>
+        </w:r>
+      </w:hyperlink>
+    </w:p>
+    <w:p>
+      <w:pPr>
+        <w:tabs>
+          <w:tab w:val="left" w:pos="400"/>
+        </w:tabs>
+        <w:spacing w:after="30" w:line="228" w:lineRule="auto"/>
+        <w:ind w:left="400" w:hanging="400"/>
+      </w:pPr>
+      <w:r>
+        <w:rPr>
+          <w:sz w:val="17"/>
+          <w:szCs w:val="17"/>
+        </w:rPr>
+        <w:t>[7]</w:t>
+        <w:tab/>
+        <w:t xml:space="preserve">D. Lin, C.-P. Bezemer, Y. Zou and A. E. Hassan, “An empirical study of game reviews on the Steam platform,” Empirical Software Engineering, vol. 24, no. 1, pp. 170–207, 2019. </w:t>
+      </w:r>
+      <w:hyperlink r:id="rIdRef7" w:history="1">
+        <w:r>
+          <w:rPr>
+            <w:rStyle w:val="Hyperlink"/>
+            <w:sz w:val="17"/>
+            <w:szCs w:val="17"/>
+          </w:rPr>
+          <w:t>https://doi.org/10.1007/s10664-018-9627-4</w:t>
+        </w:r>
+      </w:hyperlink>
+    </w:p>
+    <w:p>
+      <w:pPr>
+        <w:tabs>
+          <w:tab w:val="left" w:pos="400"/>
+        </w:tabs>
+        <w:spacing w:after="30" w:line="228" w:lineRule="auto"/>
+        <w:ind w:left="400" w:hanging="400"/>
+      </w:pPr>
+      <w:r>
+        <w:rPr>
+          <w:sz w:val="17"/>
+          <w:szCs w:val="17"/>
+        </w:rPr>
+        <w:t>[8]</w:t>
+        <w:tab/>
+        <w:t xml:space="preserve">D. Lin, C.-P. Bezemer and A. E. Hassan, “Studying the urgent updates of popular games on the Steam platform,” Empirical Software Engineering, vol. 22, no. 4, pp. 2095–2126, 2017. </w:t>
+      </w:r>
+      <w:hyperlink r:id="rIdRef8" w:history="1">
+        <w:r>
+          <w:rPr>
+            <w:rStyle w:val="Hyperlink"/>
+            <w:sz w:val="17"/>
+            <w:szCs w:val="17"/>
+          </w:rPr>
+          <w:t>https://doi.org/10.1007/s10664-016-9480-2</w:t>
+        </w:r>
+      </w:hyperlink>
+    </w:p>
+    <w:p>
+      <w:pPr>
+        <w:tabs>
+          <w:tab w:val="left" w:pos="400"/>
+        </w:tabs>
+        <w:spacing w:after="30" w:line="228" w:lineRule="auto"/>
+        <w:ind w:left="400" w:hanging="400"/>
+      </w:pPr>
+      <w:r>
+        <w:rPr>
+          <w:sz w:val="17"/>
+          <w:szCs w:val="17"/>
+        </w:rPr>
+        <w:t>[9]</w:t>
+        <w:tab/>
+        <w:t xml:space="preserve">C. Lu, X. Li, T. Nummenmaa, Z. Zhang and J. Peltonen, “Patches and player community perceptions: Analysis of No Man’s Sky Steam reviews,” in Proc. DiGRA, 2020. </w:t>
+      </w:r>
+      <w:hyperlink r:id="rIdRef9" w:history="1">
+        <w:r>
+          <w:rPr>
+            <w:rStyle w:val="Hyperlink"/>
+            <w:sz w:val="17"/>
+            <w:szCs w:val="17"/>
+          </w:rPr>
+          <w:t>https://doi.org/10.26503/dl.v2020i1.1303</w:t>
+        </w:r>
+      </w:hyperlink>
+    </w:p>
+    <w:p>
+      <w:pPr>
+        <w:tabs>
+          <w:tab w:val="left" w:pos="400"/>
+        </w:tabs>
+        <w:spacing w:after="30" w:line="228" w:lineRule="auto"/>
+        <w:ind w:left="400" w:hanging="400"/>
+      </w:pPr>
+      <w:r>
+        <w:rPr>
+          <w:sz w:val="17"/>
+          <w:szCs w:val="17"/>
+        </w:rPr>
+        <w:t>[10]</w:t>
+        <w:tab/>
+        <w:t xml:space="preserve">A. Truelove, E. Santana de Almeida and I. Ahmed, “We’ll fix it in post: What do bug fixes in video game update notes tell us?” in Proc. ICSE, 2021, pp. 736–747. </w:t>
+      </w:r>
+      <w:hyperlink r:id="rIdRef10" w:history="1">
+        <w:r>
+          <w:rPr>
+            <w:rStyle w:val="Hyperlink"/>
+            <w:sz w:val="17"/>
+            <w:szCs w:val="17"/>
+          </w:rPr>
+          <w:t>https://doi.org/10.1109/ICSE43902.2021.00073</w:t>
+        </w:r>
+      </w:hyperlink>
+    </w:p>
+    <w:p>
+      <w:pPr>
+        <w:tabs>
+          <w:tab w:val="left" w:pos="400"/>
+        </w:tabs>
+        <w:spacing w:after="30" w:line="228" w:lineRule="auto"/>
+        <w:ind w:left="400" w:hanging="400"/>
+      </w:pPr>
+      <w:r>
+        <w:rPr>
+          <w:sz w:val="17"/>
+          <w:szCs w:val="17"/>
+        </w:rPr>
+        <w:t>[11]</w:t>
+        <w:tab/>
+        <w:t xml:space="preserve">S. L. Abebe, N. Ali and A. E. Hassan, “An empirical study of software release notes,” Empirical Software Engineering, vol. 21, no. 3, pp. 1107–1142, 2016. </w:t>
+      </w:r>
+      <w:hyperlink r:id="rIdRef11" w:history="1">
+        <w:r>
+          <w:rPr>
+            <w:rStyle w:val="Hyperlink"/>
+            <w:sz w:val="17"/>
+            <w:szCs w:val="17"/>
+          </w:rPr>
+          <w:t>https://doi.org/10.1007/s10664-015-9377-5</w:t>
+        </w:r>
+      </w:hyperlink>
+    </w:p>
+    <w:p>
+      <w:pPr>
+        <w:tabs>
+          <w:tab w:val="left" w:pos="400"/>
+        </w:tabs>
+        <w:spacing w:after="30" w:line="228" w:lineRule="auto"/>
+        <w:ind w:left="400" w:hanging="400"/>
+      </w:pPr>
+      <w:r>
+        <w:rPr>
+          <w:sz w:val="17"/>
+          <w:szCs w:val="17"/>
+        </w:rPr>
+        <w:t>[12]</w:t>
+        <w:tab/>
+        <w:t xml:space="preserve">J. Wu, W. Xu, K. Gao, J. Li and M. Zhou, “Characterize software release notes of GitHub projects: Structure, writing style, and content,” in Proc. SANER, 2023, pp. 473–484. </w:t>
+      </w:r>
+      <w:hyperlink r:id="rIdRef12" w:history="1">
+        <w:r>
+          <w:rPr>
+            <w:rStyle w:val="Hyperlink"/>
+            <w:sz w:val="17"/>
+            <w:szCs w:val="17"/>
+          </w:rPr>
+          <w:t>https://doi.org/10.1109/SANER56733.2023.00051</w:t>
+        </w:r>
+      </w:hyperlink>
+    </w:p>
+    <w:p>
+      <w:pPr>
+        <w:tabs>
+          <w:tab w:val="left" w:pos="400"/>
+        </w:tabs>
+        <w:spacing w:after="30" w:line="228" w:lineRule="auto"/>
+        <w:ind w:left="400" w:hanging="400"/>
+      </w:pPr>
+      <w:r>
+        <w:rPr>
+          <w:sz w:val="17"/>
+          <w:szCs w:val="17"/>
+        </w:rPr>
+        <w:t>[13]</w:t>
+        <w:tab/>
+        <w:t xml:space="preserve">E. Choi, J. Palomaki, M. Lamm, T. Kwiatkowski, D. Das and M. Collins, “Decontextualization: Making sentences stand-alone,” Transactions of the Association for Computational Linguistics, vol. 9, pp. 447–461, 2021. </w:t>
+      </w:r>
+      <w:hyperlink r:id="rIdRef13" w:history="1">
+        <w:r>
+          <w:rPr>
+            <w:rStyle w:val="Hyperlink"/>
+            <w:sz w:val="17"/>
+            <w:szCs w:val="17"/>
+          </w:rPr>
+          <w:t>https://doi.org/10.1162/tacl_a_00377</w:t>
+        </w:r>
+      </w:hyperlink>
+    </w:p>
+    <w:p>
+      <w:pPr>
+        <w:tabs>
+          <w:tab w:val="left" w:pos="400"/>
+        </w:tabs>
+        <w:spacing w:after="30" w:line="228" w:lineRule="auto"/>
+        <w:ind w:left="400" w:hanging="400"/>
+      </w:pPr>
+      <w:r>
+        <w:rPr>
+          <w:sz w:val="17"/>
+          <w:szCs w:val="17"/>
+        </w:rPr>
+        <w:t>[14]</w:t>
+        <w:tab/>
+        <w:t xml:space="preserve">Z. Wang, J. Li, X. Guo and T. Tsuchiya, “From noisy feedback to evidence-aware issue specifications: An agent-governed retrieval-augmented generation approach,” Automated Software Engineering, vol. 33, art. 103, 2026. </w:t>
+      </w:r>
+      <w:hyperlink r:id="rIdRef14" w:history="1">
         <w:r>
           <w:rPr>
             <w:rStyle w:val="Hyperlink"/>
@@ -8378,24 +8111,36 @@
           <w:sz w:val="17"/>
           <w:szCs w:val="17"/>
         </w:rPr>
-        <w:t>[4]</w:t>
-      </w:r>
+        <w:t>[15]</w:t>
+        <w:tab/>
+        <w:t xml:space="preserve">Y. Geifman and R. El-Yaniv, “SelectiveNet: A deep neural network with an integrated reject option,” in Proc. ICML, vol. 97, pp. 2151–2159, 2019.</w:t>
+      </w:r>
+    </w:p>
+    <w:p>
+      <w:pPr>
+        <w:tabs>
+          <w:tab w:val="left" w:pos="400"/>
+        </w:tabs>
+        <w:spacing w:after="30" w:line="228" w:lineRule="auto"/>
+        <w:ind w:left="400" w:hanging="400"/>
+      </w:pPr>
       <w:r>
         <w:rPr>
           <w:sz w:val="17"/>
           <w:szCs w:val="17"/>
         </w:rPr>
+        <w:t>[16]</w:t>
         <w:tab/>
-        <w:t xml:space="preserve">K. Wang, N. Reimers and I. Gurevych, “DAPR: A benchmark on document-aware passage retrieval,” in Proc. ACL, 2024. </w:t>
-      </w:r>
-      <w:hyperlink r:id="rId12" w:history="1">
+        <w:t xml:space="preserve">R. Saurí and J. Pustejovsky, “FactBank: A corpus annotated with event factuality,” Language Resources and Evaluation, vol. 43, no. 3, pp. 227–268, 2009. </w:t>
+      </w:r>
+      <w:hyperlink r:id="rIdRef16" w:history="1">
         <w:r>
           <w:rPr>
             <w:rStyle w:val="Hyperlink"/>
             <w:sz w:val="17"/>
             <w:szCs w:val="17"/>
           </w:rPr>
-          <w:t>https://aclanthology.org/2024.acl-long.236/</w:t>
+          <w:t>https://doi.org/10.1007/s10579-009-9089-9</w:t>
         </w:r>
       </w:hyperlink>
     </w:p>
@@ -8412,40 +8157,18 @@
           <w:sz w:val="17"/>
           <w:szCs w:val="17"/>
         </w:rPr>
-        <w:t>[5]</w:t>
-      </w:r>
-      <w:r>
-        <w:rPr>
-          <w:sz w:val="17"/>
-          <w:szCs w:val="17"/>
-        </w:rPr>
+        <w:t>[17]</w:t>
         <w:tab/>
-        <w:t xml:space="preserve">D. Lin, C.-P. </w:t>
-      </w:r>
-      <w:proofErr w:type="spellStart"/>
-      <w:r>
-        <w:rPr>
-          <w:sz w:val="17"/>
-          <w:szCs w:val="17"/>
-        </w:rPr>
-        <w:t>Bezemer</w:t>
-      </w:r>
-      <w:proofErr w:type="spellEnd"/>
-      <w:r>
-        <w:rPr>
-          <w:sz w:val="17"/>
-          <w:szCs w:val="17"/>
-        </w:rPr>
-        <w:t xml:space="preserve"> and A. E. Hassan, “Studying the urgent updates of popular games on the Steam platform,” Empirical Software Engineering, 2017. </w:t>
-      </w:r>
-      <w:hyperlink r:id="rId13" w:history="1">
+        <w:t xml:space="preserve">Ö. Uzuner, B. R. South, S. Shen and S. L. DuVall, “2010 i2b2/VA challenge on concepts, assertions, and relations in clinical text,” Journal of the American Medical Informatics Association, vol. 18, no. 5, pp. 552–556, 2011. </w:t>
+      </w:r>
+      <w:hyperlink r:id="rIdRef17" w:history="1">
         <w:r>
           <w:rPr>
             <w:rStyle w:val="Hyperlink"/>
             <w:sz w:val="17"/>
             <w:szCs w:val="17"/>
           </w:rPr>
-          <w:t>https://sail.cs.queensu.ca/data/pdfs/EMSE2016_StudyingTheUrgentUpdatesOfPopularGamesOnTheSteamPlatform.pdf</w:t>
+          <w:t>https://doi.org/10.1136/amiajnl-2011-000203</w:t>
         </w:r>
       </w:hyperlink>
     </w:p>
@@ -8462,24 +8185,18 @@
           <w:sz w:val="17"/>
           <w:szCs w:val="17"/>
         </w:rPr>
-        <w:t>[6]</w:t>
-      </w:r>
-      <w:r>
-        <w:rPr>
-          <w:sz w:val="17"/>
-          <w:szCs w:val="17"/>
-        </w:rPr>
+        <w:t>[18]</w:t>
         <w:tab/>
-        <w:t xml:space="preserve">S. L. Abebe, N. Ali and A. E. Hassan, “An empirical study of software release notes,” Empirical Software Engineering, 2016. </w:t>
-      </w:r>
-      <w:hyperlink r:id="rId14" w:history="1">
+        <w:t xml:space="preserve">H. Harkema, J. N. Dowling, T. Thornblade and W. W. Chapman, “ConText: An algorithm for determining negation, experiencer, and temporal status from clinical reports,” Journal of Biomedical Informatics, vol. 42, no. 5, pp. 839–851, 2009. </w:t>
+      </w:r>
+      <w:hyperlink r:id="rIdRef18" w:history="1">
         <w:r>
           <w:rPr>
             <w:rStyle w:val="Hyperlink"/>
             <w:sz w:val="17"/>
             <w:szCs w:val="17"/>
           </w:rPr>
-          <w:t>https://doi.org/10.1007/s10664-015-9377-5</w:t>
+          <w:t>https://doi.org/10.1016/j.jbi.2009.05.002</w:t>
         </w:r>
       </w:hyperlink>
     </w:p>
@@ -8496,123 +8213,11 @@
           <w:sz w:val="17"/>
           <w:szCs w:val="17"/>
         </w:rPr>
-        <w:t>[7]</w:t>
-      </w:r>
-      <w:r>
-        <w:rPr>
-          <w:sz w:val="17"/>
-          <w:szCs w:val="17"/>
-        </w:rPr>
+        <w:t>[19]</w:t>
         <w:tab/>
-        <w:t xml:space="preserve">A. Truelove, E. Santana de Almeida and I. Ahmed, “We’ll fix it in post: What do bug fixes in video game update notes tell us?” in Proc. ICSE, 2021. </w:t>
-      </w:r>
-      <w:hyperlink r:id="rId15" w:history="1">
-        <w:r>
-          <w:rPr>
-            <w:rStyle w:val="Hyperlink"/>
-            <w:sz w:val="17"/>
-            <w:szCs w:val="17"/>
-          </w:rPr>
-          <w:t>https://arxiv.org/abs/2103.03997</w:t>
-        </w:r>
-      </w:hyperlink>
-    </w:p>
-    <w:p>
-      <w:pPr>
-        <w:tabs>
-          <w:tab w:val="left" w:pos="400"/>
-        </w:tabs>
-        <w:spacing w:after="30" w:line="228" w:lineRule="auto"/>
-        <w:ind w:left="400" w:hanging="400"/>
-      </w:pPr>
-      <w:r>
-        <w:rPr>
-          <w:sz w:val="17"/>
-          <w:szCs w:val="17"/>
-        </w:rPr>
-        <w:t>[8]</w:t>
-      </w:r>
-      <w:r>
-        <w:rPr>
-          <w:sz w:val="17"/>
-          <w:szCs w:val="17"/>
-        </w:rPr>
-        <w:tab/>
-        <w:t xml:space="preserve">Y. </w:t>
-      </w:r>
-      <w:proofErr w:type="spellStart"/>
-      <w:r>
-        <w:rPr>
-          <w:sz w:val="17"/>
-          <w:szCs w:val="17"/>
-        </w:rPr>
-        <w:t>Geifman</w:t>
-      </w:r>
-      <w:proofErr w:type="spellEnd"/>
-      <w:r>
-        <w:rPr>
-          <w:sz w:val="17"/>
-          <w:szCs w:val="17"/>
-        </w:rPr>
-        <w:t xml:space="preserve"> and R. El-Yaniv, “</w:t>
-      </w:r>
-      <w:proofErr w:type="spellStart"/>
-      <w:r>
-        <w:rPr>
-          <w:sz w:val="17"/>
-          <w:szCs w:val="17"/>
-        </w:rPr>
-        <w:t>SelectiveNet</w:t>
-      </w:r>
-      <w:proofErr w:type="spellEnd"/>
-      <w:r>
-        <w:rPr>
-          <w:sz w:val="17"/>
-          <w:szCs w:val="17"/>
-        </w:rPr>
-        <w:t>: A deep neural network with an integrated reject option,” in Proc. ICML, vol. 97, pp. 2151–2159, 2019.</w:t>
-      </w:r>
-    </w:p>
-    <w:p>
-      <w:pPr>
-        <w:tabs>
-          <w:tab w:val="left" w:pos="400"/>
-        </w:tabs>
-        <w:spacing w:after="30" w:line="228" w:lineRule="auto"/>
-        <w:ind w:left="400" w:hanging="400"/>
-      </w:pPr>
-      <w:r>
-        <w:rPr>
-          <w:sz w:val="17"/>
-          <w:szCs w:val="17"/>
-        </w:rPr>
-        <w:t>[9]</w:t>
-      </w:r>
-      <w:r>
-        <w:rPr>
-          <w:sz w:val="17"/>
-          <w:szCs w:val="17"/>
-        </w:rPr>
-        <w:tab/>
-        <w:t xml:space="preserve">C.-C. Chen et al., “SemEval-2025 Task 6: Multinational, multilingual, multi-industry promise verification,” in Proc. </w:t>
-      </w:r>
-      <w:proofErr w:type="spellStart"/>
-      <w:r>
-        <w:rPr>
-          <w:sz w:val="17"/>
-          <w:szCs w:val="17"/>
-        </w:rPr>
-        <w:t>SemEval</w:t>
-      </w:r>
-      <w:proofErr w:type="spellEnd"/>
-      <w:r>
-        <w:rPr>
-          <w:sz w:val="17"/>
-          <w:szCs w:val="17"/>
-        </w:rPr>
-        <w:t xml:space="preserve">, 2025, pp. 2461–2471. </w:t>
-      </w:r>
-      <w:hyperlink r:id="rId16" w:history="1">
+        <w:t xml:space="preserve">C.-C. Chen et al., “SemEval-2025 Task 6: Multinational, multilingual, multi-industry promise verification,” in Proc. SemEval, 2025, pp. 2461–2471. </w:t>
+      </w:r>
+      <w:hyperlink r:id="rIdRef19" w:history="1">
         <w:r>
           <w:rPr>
             <w:rStyle w:val="Hyperlink"/>
@@ -8636,15 +8241,9 @@
           <w:sz w:val="17"/>
           <w:szCs w:val="17"/>
         </w:rPr>
-        <w:t>[10]</w:t>
-      </w:r>
-      <w:r>
-        <w:rPr>
-          <w:sz w:val="17"/>
-          <w:szCs w:val="17"/>
-        </w:rPr>
+        <w:t>[20]</w:t>
         <w:tab/>
-        <w:t>M. Gardner et al., “Evaluating models’ local decision boundaries via contrast sets,” in Findings of EMNLP, 2020.</w:t>
+        <w:t xml:space="preserve">M. Gardner et al., “Evaluating models’ local decision boundaries via contrast sets,” in Findings of EMNLP, 2020, pp. 1307–1323.</w:t>
       </w:r>
     </w:p>
     <w:p>
@@ -8660,47 +8259,9 @@
           <w:sz w:val="17"/>
           <w:szCs w:val="17"/>
         </w:rPr>
-        <w:t>[11]</w:t>
-      </w:r>
-      <w:r>
-        <w:rPr>
-          <w:sz w:val="17"/>
-          <w:szCs w:val="17"/>
-        </w:rPr>
+        <w:t>[21]</w:t>
         <w:tab/>
-        <w:t xml:space="preserve">M. T. Ribeiro, T. Wu, C. </w:t>
-      </w:r>
-      <w:proofErr w:type="spellStart"/>
-      <w:r>
-        <w:rPr>
-          <w:sz w:val="17"/>
-          <w:szCs w:val="17"/>
-        </w:rPr>
-        <w:t>Guestrin</w:t>
-      </w:r>
-      <w:proofErr w:type="spellEnd"/>
-      <w:r>
-        <w:rPr>
-          <w:sz w:val="17"/>
-          <w:szCs w:val="17"/>
-        </w:rPr>
-        <w:t xml:space="preserve"> and S. Singh, “Beyond accuracy: Behavioral testing of NLP models with </w:t>
-      </w:r>
-      <w:proofErr w:type="spellStart"/>
-      <w:r>
-        <w:rPr>
-          <w:sz w:val="17"/>
-          <w:szCs w:val="17"/>
-        </w:rPr>
-        <w:t>CheckList</w:t>
-      </w:r>
-      <w:proofErr w:type="spellEnd"/>
-      <w:r>
-        <w:rPr>
-          <w:sz w:val="17"/>
-          <w:szCs w:val="17"/>
-        </w:rPr>
-        <w:t>,” in Proc. ACL, 2020.</w:t>
+        <w:t xml:space="preserve">M. T. Ribeiro, T. Wu, C. Guestrin and S. Singh, “Beyond accuracy: Behavioral testing of NLP models with CheckList,” in Proc. ACL, 2020.</w:t>
       </w:r>
     </w:p>
     <w:p>
@@ -8716,17 +8277,11 @@
           <w:sz w:val="17"/>
           <w:szCs w:val="17"/>
         </w:rPr>
-        <w:t>[12]</w:t>
-      </w:r>
-      <w:r>
-        <w:rPr>
-          <w:sz w:val="17"/>
-          <w:szCs w:val="17"/>
-        </w:rPr>
+        <w:t>[22]</w:t>
         <w:tab/>
         <w:t xml:space="preserve">Valve, “User reviews – Get list,” Steamworks documentation. </w:t>
       </w:r>
-      <w:hyperlink r:id="rId17" w:history="1">
+      <w:hyperlink r:id="rIdRef22" w:history="1">
         <w:r>
           <w:rPr>
             <w:rStyle w:val="Hyperlink"/>
@@ -8750,33 +8305,11 @@
           <w:sz w:val="17"/>
           <w:szCs w:val="17"/>
         </w:rPr>
-        <w:t>[13]</w:t>
-      </w:r>
-      <w:r>
-        <w:rPr>
-          <w:sz w:val="17"/>
-          <w:szCs w:val="17"/>
-        </w:rPr>
+        <w:t>[23]</w:t>
         <w:tab/>
-        <w:t>Valve, “</w:t>
-      </w:r>
-      <w:proofErr w:type="spellStart"/>
-      <w:r>
-        <w:rPr>
-          <w:sz w:val="17"/>
-          <w:szCs w:val="17"/>
-        </w:rPr>
-        <w:t>ISteamNews</w:t>
-      </w:r>
-      <w:proofErr w:type="spellEnd"/>
-      <w:r>
-        <w:rPr>
-          <w:sz w:val="17"/>
-          <w:szCs w:val="17"/>
-        </w:rPr>
-        <w:t xml:space="preserve"> interface,” Steamworks documentation. </w:t>
-      </w:r>
-      <w:hyperlink r:id="rId18" w:history="1">
+        <w:t xml:space="preserve">Valve, “ISteamNews interface,” Steamworks documentation. </w:t>
+      </w:r>
+      <w:hyperlink r:id="rIdRef23" w:history="1">
         <w:r>
           <w:rPr>
             <w:rStyle w:val="Hyperlink"/>
@@ -8800,15 +8333,9 @@
           <w:sz w:val="17"/>
           <w:szCs w:val="17"/>
         </w:rPr>
-        <w:t>[14]</w:t>
-      </w:r>
-      <w:r>
-        <w:rPr>
-          <w:sz w:val="17"/>
-          <w:szCs w:val="17"/>
-        </w:rPr>
+        <w:t>[24]</w:t>
         <w:tab/>
-        <w:t>J. Cohen, “A coefficient of agreement for nominal scales,” Educational and Psychological Measurement, vol. 20, no. 1, pp. 37–46, 1960.</w:t>
+        <w:t xml:space="preserve">J. Cohen, “A coefficient of agreement for nominal scales,” Educational and Psychological Measurement, vol. 20, no. 1, pp. 37–46, 1960.</w:t>
       </w:r>
     </w:p>
     <w:p>
@@ -8824,15 +8351,9 @@
           <w:sz w:val="17"/>
           <w:szCs w:val="17"/>
         </w:rPr>
-        <w:t>[15]</w:t>
-      </w:r>
-      <w:r>
-        <w:rPr>
-          <w:sz w:val="17"/>
-          <w:szCs w:val="17"/>
-        </w:rPr>
+        <w:t>[25]</w:t>
         <w:tab/>
-        <w:t>J. Cohen, “Weighted kappa: Nominal scale agreement provision for scaled disagreement or partial credit,” Psychological Bulletin, vol. 70, no. 4, pp. 213–220, 1968.</w:t>
+        <w:t xml:space="preserve">J. Cohen, “Weighted kappa: Nominal scale agreement provision for scaled disagreement or partial credit,” Psychological Bulletin, vol. 70, no. 4, pp. 213–220, 1968.</w:t>
       </w:r>
     </w:p>
     <w:p>
@@ -8848,31 +8369,9 @@
           <w:sz w:val="17"/>
           <w:szCs w:val="17"/>
         </w:rPr>
-        <w:t>[16]</w:t>
-      </w:r>
-      <w:r>
-        <w:rPr>
-          <w:sz w:val="17"/>
-          <w:szCs w:val="17"/>
-        </w:rPr>
+        <w:t>[26]</w:t>
         <w:tab/>
-        <w:t xml:space="preserve">A. Ratner, S. H. Bach, H. Ehrenberg, J. Fries, S. Wu and C. </w:t>
-      </w:r>
-      <w:proofErr w:type="spellStart"/>
-      <w:r>
-        <w:rPr>
-          <w:sz w:val="17"/>
-          <w:szCs w:val="17"/>
-        </w:rPr>
-        <w:t>Ré</w:t>
-      </w:r>
-      <w:proofErr w:type="spellEnd"/>
-      <w:r>
-        <w:rPr>
-          <w:sz w:val="17"/>
-          <w:szCs w:val="17"/>
-        </w:rPr>
-        <w:t>, “Snorkel: Rapid training data creation with weak supervision,” Proc. VLDB Endowment, vol. 11, no. 3, pp. 269–282, 2017.</w:t>
+        <w:t xml:space="preserve">A. Ratner, S. H. Bach, H. Ehrenberg, J. Fries, S. Wu and C. Ré, “Snorkel: Rapid training data creation with weak supervision,” Proc. VLDB Endowment, vol. 11, no. 3, pp. 269–282, 2017.</w:t>
       </w:r>
     </w:p>
     <w:p>
@@ -8888,15 +8387,9 @@
           <w:sz w:val="17"/>
           <w:szCs w:val="17"/>
         </w:rPr>
-        <w:t>[17]</w:t>
-      </w:r>
-      <w:r>
-        <w:rPr>
-          <w:sz w:val="17"/>
-          <w:szCs w:val="17"/>
-        </w:rPr>
+        <w:t>[27]</w:t>
         <w:tab/>
-        <w:t>S. Robertson and H. Zaragoza, “The probabilistic relevance framework: BM25 and beyond,” Foundations and Trends in Information Retrieval, vol. 3, no. 4, pp. 333–389, 2009.</w:t>
+        <w:t xml:space="preserve">S. Robertson and H. Zaragoza, “The probabilistic relevance framework: BM25 and beyond,” Foundations and Trends in Information Retrieval, vol. 3, no. 4, pp. 333–389, 2009.</w:t>
       </w:r>
     </w:p>
     <w:p>
@@ -8912,47 +8405,9 @@
           <w:sz w:val="17"/>
           <w:szCs w:val="17"/>
         </w:rPr>
-        <w:t>[18]</w:t>
-      </w:r>
-      <w:r>
-        <w:rPr>
-          <w:sz w:val="17"/>
-          <w:szCs w:val="17"/>
-        </w:rPr>
+        <w:t>[28]</w:t>
         <w:tab/>
-        <w:t xml:space="preserve">B. Efron and R. J. </w:t>
-      </w:r>
-      <w:proofErr w:type="spellStart"/>
-      <w:r>
-        <w:rPr>
-          <w:sz w:val="17"/>
-          <w:szCs w:val="17"/>
-        </w:rPr>
-        <w:t>Tibshirani</w:t>
-      </w:r>
-      <w:proofErr w:type="spellEnd"/>
-      <w:r>
-        <w:rPr>
-          <w:sz w:val="17"/>
-          <w:szCs w:val="17"/>
-        </w:rPr>
-        <w:t xml:space="preserve">, An Introduction to </w:t>
-      </w:r>
-      <w:proofErr w:type="gramStart"/>
-      <w:r>
-        <w:rPr>
-          <w:sz w:val="17"/>
-          <w:szCs w:val="17"/>
-        </w:rPr>
-        <w:t>the Bootstrap</w:t>
-      </w:r>
-      <w:proofErr w:type="gramEnd"/>
-      <w:r>
-        <w:rPr>
-          <w:sz w:val="17"/>
-          <w:szCs w:val="17"/>
-        </w:rPr>
-        <w:t>. Chapman &amp; Hall, 1993.</w:t>
+        <w:t xml:space="preserve">B. Efron and R. J. Tibshirani, An Introduction to the Bootstrap. Chapman &amp; Hall, 1993.</w:t>
       </w:r>
     </w:p>
     <w:p>
@@ -8968,15 +8423,9 @@
           <w:sz w:val="17"/>
           <w:szCs w:val="17"/>
         </w:rPr>
-        <w:t>[19]</w:t>
-      </w:r>
-      <w:r>
-        <w:rPr>
-          <w:sz w:val="17"/>
-          <w:szCs w:val="17"/>
-        </w:rPr>
+        <w:t>[29]</w:t>
         <w:tab/>
-        <w:t>Q. McNemar, “Note on the sampling error of the difference between correlated proportions or percentages,” Psychometrika, vol. 12, no. 2, pp. 153–157, 1947.</w:t>
+        <w:t xml:space="preserve">Q. McNemar, “Note on the sampling error of the difference between correlated proportions or percentages,” Psychometrika, vol. 12, no. 2, pp. 153–157, 1947.</w:t>
       </w:r>
     </w:p>
     <w:p>
@@ -8992,15 +8441,9 @@
           <w:sz w:val="17"/>
           <w:szCs w:val="17"/>
         </w:rPr>
-        <w:t>[20]</w:t>
-      </w:r>
-      <w:r>
-        <w:rPr>
-          <w:sz w:val="17"/>
-          <w:szCs w:val="17"/>
-        </w:rPr>
+        <w:t>[30]</w:t>
         <w:tab/>
-        <w:t>S. Holm, “A simple sequentially rejective multiple test procedure,” Scandinavian Journal of Statistics, vol. 6, no. 2, pp. 65–70, 1979.</w:t>
+        <w:t xml:space="preserve">S. Holm, “A simple sequentially rejective multiple test procedure,” Scandinavian Journal of Statistics, vol. 6, no. 2, pp. 65–70, 1979.</w:t>
       </w:r>
     </w:p>
     <w:p>
@@ -9016,17 +8459,11 @@
           <w:sz w:val="17"/>
           <w:szCs w:val="17"/>
         </w:rPr>
-        <w:t>[21]</w:t>
-      </w:r>
-      <w:r>
-        <w:rPr>
-          <w:sz w:val="17"/>
-          <w:szCs w:val="17"/>
-        </w:rPr>
+        <w:t>[31]</w:t>
         <w:tab/>
         <w:t xml:space="preserve">Valve, “Steam Web API terms of use.” </w:t>
       </w:r>
-      <w:hyperlink r:id="rId19" w:history="1">
+      <w:hyperlink r:id="rIdRef31" w:history="1">
         <w:r>
           <w:rPr>
             <w:rStyle w:val="Hyperlink"/>
@@ -9075,6 +8512,7 @@
     </w:p>
     <w:p>
       <w:pPr>
+        <w:keepNext/>
         <w:tabs>
           <w:tab w:val="left" w:pos="400"/>
         </w:tabs>
@@ -9100,15 +8538,7 @@
         <w:ind w:left="400" w:hanging="400"/>
       </w:pPr>
       <w:r>
-        <w:t>We stored the 30 game names and Steam app IDs in data/</w:t>
-      </w:r>
-      <w:proofErr w:type="spellStart"/>
-      <w:r>
-        <w:t>games.json</w:t>
-      </w:r>
-      <w:proofErr w:type="spellEnd"/>
-      <w:r>
-        <w:t>. The collector reads that list and saves a separate folder for each game. We selected the games deliberately to cover several game types and update histories. The original five game pilot remains separate; we did not add its review count to the new total because the collections can overlap.</w:t>
+        <w:t>We stored the 30 game names and Steam app IDs in data/games.json. The collector reads that list and saves a separate folder for each game. We selected the games deliberately to cover several game types and update histories. The original five game pilot remains separate; we did not add its review count to the new total because the collections can overlap.</w:t>
       </w:r>
     </w:p>
     <w:p>
@@ -9120,31 +8550,7 @@
         <w:ind w:left="400" w:hanging="400"/>
       </w:pPr>
       <w:r>
-        <w:t xml:space="preserve">We used scripts/collect_steam.py to request public data as JSON, rather than copy reviews from browser pages. All 30 saved game states used </w:t>
-      </w:r>
-      <w:proofErr w:type="spellStart"/>
-      <w:r>
-        <w:t>IUserReviewsService</w:t>
-      </w:r>
-      <w:proofErr w:type="spellEnd"/>
-      <w:r>
-        <w:t>/</w:t>
-      </w:r>
-      <w:proofErr w:type="spellStart"/>
-      <w:r>
-        <w:t>GetAppReviews</w:t>
-      </w:r>
-      <w:proofErr w:type="spellEnd"/>
-      <w:r>
-        <w:t xml:space="preserve">/v1. The collector also supports the older </w:t>
-      </w:r>
-      <w:proofErr w:type="spellStart"/>
-      <w:r>
-        <w:t>appreviews</w:t>
-      </w:r>
-      <w:proofErr w:type="spellEnd"/>
-      <w:r>
-        <w:t xml:space="preserve"> endpoint, while preserving the endpoint used by an existing saved cursor.</w:t>
+        <w:t xml:space="preserve">We used scripts/collect_steam.py to request public data as JSON, rather than copy reviews from browser pages. All 30 saved game states used IUserReviewsService/GetAppReviews/v1. The collector also supports the older appreviews endpoint, while preserving the endpoint used by an existing saved cursor.</w:t>
       </w:r>
     </w:p>
     <w:p>
@@ -9168,19 +8574,12 @@
         <w:ind w:left="400" w:hanging="400"/>
       </w:pPr>
       <w:r>
-        <w:t xml:space="preserve">For each game, we stopped after saving at least 1,000 English reviews with </w:t>
-      </w:r>
-      <w:proofErr w:type="gramStart"/>
-      <w:r>
-        <w:t>10 or more word</w:t>
-      </w:r>
-      <w:proofErr w:type="gramEnd"/>
-      <w:r>
-        <w:t xml:space="preserve"> tokens. We also set a safety limit of 10,000 raw reviews per game. We retained every short review returned on those pages. The last page could take the qualifying total above 1,000. This is why the downloaded collection contains 73,337 records rather than 30,000. Busy games cover a shorter period than quieter games.</w:t>
-      </w:r>
-    </w:p>
-    <w:p>
-      <w:pPr>
+        <w:t xml:space="preserve">For each game, we stopped after saving at least 1,000 English reviews with 10 or more word tokens. We also set a safety limit of 10,000 raw reviews per game. We retained every short review returned on those pages. The last page could take the qualifying total above 1,000. This is why the downloaded collection contains 73,337 records rather than 30,000. Busy games cover a shorter period than quieter games.</w:t>
+      </w:r>
+    </w:p>
+    <w:p>
+      <w:pPr>
+        <w:keepNext/>
         <w:tabs>
           <w:tab w:val="left" w:pos="400"/>
         </w:tabs>
@@ -9206,15 +8605,7 @@
         <w:ind w:left="400" w:hanging="400"/>
       </w:pPr>
       <w:r>
-        <w:t xml:space="preserve">We saved the original review text, recommendation, language, creation and latest update times, and available playtime fields. We kept collection times and </w:t>
-      </w:r>
-      <w:proofErr w:type="gramStart"/>
-      <w:r>
-        <w:t>source</w:t>
-      </w:r>
-      <w:proofErr w:type="gramEnd"/>
-      <w:r>
-        <w:t xml:space="preserve"> endpoint information. Before saving, we replaced Steam author IDs with salted hashes and kept only selected author statistics. Review IDs remain so that we can check repeated records.</w:t>
+        <w:t xml:space="preserve">We saved the original review text, recommendation, language, creation and latest update times, and available playtime fields. We kept collection times and source endpoint information. Before saving, we replaced Steam author IDs with salted hashes and kept only selected author statistics. Review IDs remain so that we can check repeated records.</w:t>
       </w:r>
     </w:p>
     <w:p>
@@ -9226,38 +8617,7 @@
         <w:ind w:left="400" w:hanging="400"/>
       </w:pPr>
       <w:r>
-        <w:t xml:space="preserve">We wrote new rows to </w:t>
-      </w:r>
-      <w:proofErr w:type="spellStart"/>
-      <w:proofErr w:type="gramStart"/>
-      <w:r>
-        <w:t>reviews.jsonl</w:t>
-      </w:r>
-      <w:proofErr w:type="spellEnd"/>
-      <w:proofErr w:type="gramEnd"/>
-      <w:r>
-        <w:t xml:space="preserve">, one JSON record per line, and flushed them to disk before advancing the cursor in </w:t>
-      </w:r>
-      <w:proofErr w:type="spellStart"/>
-      <w:r>
-        <w:t>review_</w:t>
-      </w:r>
-      <w:proofErr w:type="gramStart"/>
-      <w:r>
-        <w:t>state.json</w:t>
-      </w:r>
-      <w:proofErr w:type="spellEnd"/>
-      <w:proofErr w:type="gramEnd"/>
-      <w:r>
-        <w:t xml:space="preserve">. If the script stops between those steps, the next run can fetch the same page again. It </w:t>
-      </w:r>
-      <w:proofErr w:type="spellStart"/>
-      <w:r>
-        <w:t>recognises</w:t>
-      </w:r>
-      <w:proofErr w:type="spellEnd"/>
-      <w:r>
-        <w:t xml:space="preserve"> the saved review IDs and skips duplicates. It can repair an incomplete last line after an interrupted write; it stops if corruption occurs inside the file.</w:t>
+        <w:t xml:space="preserve">We wrote new rows to reviews.jsonl, one JSON record per line, and flushed them to disk before advancing the cursor in review_state.json. If the script stops between those steps, the next run can fetch the same page again. It recognises the saved review IDs and skips duplicates. It can repair an incomplete last line after an interrupted write; it stops if corruption occurs inside the file.</w:t>
       </w:r>
     </w:p>
     <w:p>
@@ -9269,28 +8629,7 @@
         <w:ind w:left="400" w:hanging="400"/>
       </w:pPr>
       <w:r>
-        <w:t xml:space="preserve">We waited three seconds between request starts. For HTTP 429, the script </w:t>
-      </w:r>
-      <w:proofErr w:type="gramStart"/>
-      <w:r>
-        <w:t>read</w:t>
-      </w:r>
-      <w:proofErr w:type="gramEnd"/>
-      <w:r>
-        <w:t xml:space="preserve"> Steam's Retry After value. When it was missing, the wait started at about 60 seconds and increased to at most 900 seconds, with a small random delay. A server requested wait could be longer. The script saved the waiting deadline in </w:t>
-      </w:r>
-      <w:proofErr w:type="spellStart"/>
-      <w:r>
-        <w:t>http_</w:t>
-      </w:r>
-      <w:proofErr w:type="gramStart"/>
-      <w:r>
-        <w:t>state.json</w:t>
-      </w:r>
-      <w:proofErr w:type="spellEnd"/>
-      <w:proofErr w:type="gramEnd"/>
-      <w:r>
-        <w:t>, waited, and retried the same page. Restarting preserved the remaining wait.</w:t>
+        <w:t xml:space="preserve">We waited three seconds between request starts. For HTTP 429, the script read Steam's Retry After value. When it was missing, the wait started at about 60 seconds and increased to at most 900 seconds, with a small random delay. A server requested wait could be longer. The script saved the waiting deadline in http_state.json, waited, and retried the same page. Restarting preserved the remaining wait.</w:t>
       </w:r>
     </w:p>
     <w:p>
@@ -9302,27 +8641,12 @@
         <w:ind w:left="400" w:hanging="400"/>
       </w:pPr>
       <w:r>
-        <w:t xml:space="preserve">Temporary connection and server failures received a limited number of retries. </w:t>
-      </w:r>
-      <w:proofErr w:type="gramStart"/>
-      <w:r>
-        <w:t>Saved progress</w:t>
-      </w:r>
-      <w:proofErr w:type="gramEnd"/>
-      <w:r>
-        <w:t xml:space="preserve"> remained available if retries failed. A file lock prevented two collectors from </w:t>
-      </w:r>
-      <w:proofErr w:type="gramStart"/>
-      <w:r>
-        <w:t>writing to</w:t>
-      </w:r>
-      <w:proofErr w:type="gramEnd"/>
-      <w:r>
-        <w:t xml:space="preserve"> the same snapshot at once. Rerunning a completed snapshot skipped completed work; it did not refresh the newest review pages.</w:t>
-      </w:r>
-    </w:p>
-    <w:p>
-      <w:pPr>
+        <w:t xml:space="preserve">Temporary connection and server failures received a limited number of retries. Saved progress remained available if retries failed. A file lock prevented two collectors from writing to the same snapshot at once. Rerunning a completed snapshot skipped completed work; it did not refresh the newest review pages.</w:t>
+      </w:r>
+    </w:p>
+    <w:p>
+      <w:pPr>
+        <w:keepNext/>
         <w:tabs>
           <w:tab w:val="left" w:pos="400"/>
         </w:tabs>
@@ -9348,39 +8672,7 @@
         <w:ind w:left="400" w:hanging="400"/>
       </w:pPr>
       <w:r>
-        <w:t xml:space="preserve">We called </w:t>
-      </w:r>
-      <w:proofErr w:type="spellStart"/>
-      <w:r>
-        <w:t>ISteamNews</w:t>
-      </w:r>
-      <w:proofErr w:type="spellEnd"/>
-      <w:r>
-        <w:t>/</w:t>
-      </w:r>
-      <w:proofErr w:type="spellStart"/>
-      <w:r>
-        <w:t>GetNewsForApp</w:t>
-      </w:r>
-      <w:proofErr w:type="spellEnd"/>
-      <w:r>
-        <w:t xml:space="preserve">/v2 for each game and selected the </w:t>
-      </w:r>
-      <w:proofErr w:type="spellStart"/>
-      <w:r>
-        <w:t>steam_community_announcements</w:t>
-      </w:r>
-      <w:proofErr w:type="spellEnd"/>
-      <w:r>
-        <w:t xml:space="preserve"> feed. We requested full content with </w:t>
-      </w:r>
-      <w:proofErr w:type="spellStart"/>
-      <w:r>
-        <w:t>maxlength</w:t>
-      </w:r>
-      <w:proofErr w:type="spellEnd"/>
-      <w:r>
-        <w:t xml:space="preserve"> set to zero, up to 100 posts per request. We moved backwards using the oldest returned publication time and saved each news ID once. Collection stopped at 300 posts per game, the available source limit, or the cutoff of 9 October 2024.</w:t>
+        <w:t xml:space="preserve">We called ISteamNews/GetNewsForApp/v2 for each game and selected the steam_community_announcements feed. We requested full content with maxlength set to zero, up to 100 posts per request. We moved backwards using the oldest returned publication time and saved each news ID once. Collection stopped at 300 posts per game, the available source limit, or the cutoff of 9 October 2024.</w:t>
       </w:r>
     </w:p>
     <w:p>
@@ -9392,19 +8684,12 @@
         <w:ind w:left="400" w:hanging="400"/>
       </w:pPr>
       <w:r>
-        <w:t xml:space="preserve">We saved the original announcement contents and a readable text copy. The cleaning function removed formatting tags while retaining line breaks and bullet text. It did not reliably preserve a complete heading hierarchy; that still needs work for the proposed models. We collected 3,445 announcements, including news that is not a patch. Optional </w:t>
-      </w:r>
-      <w:proofErr w:type="spellStart"/>
-      <w:r>
-        <w:t>SteamSpy</w:t>
-      </w:r>
-      <w:proofErr w:type="spellEnd"/>
-      <w:r>
-        <w:t xml:space="preserve"> responses supplied game metadata and did not supply review text or patch status labels.</w:t>
-      </w:r>
-    </w:p>
-    <w:p>
-      <w:pPr>
+        <w:t xml:space="preserve">We saved the original announcement contents and a readable text copy. The cleaning function removed formatting tags while retaining line breaks and bullet text. It did not reliably preserve a complete heading hierarchy; that still needs work for the proposed models. We collected 3,445 announcements, including news that is not a patch. Optional SteamSpy responses supplied game metadata and did not supply review text or patch status labels.</w:t>
+      </w:r>
+    </w:p>
+    <w:p>
+      <w:pPr>
+        <w:keepNext/>
         <w:tabs>
           <w:tab w:val="left" w:pos="400"/>
         </w:tabs>
@@ -9430,15 +8715,7 @@
         <w:ind w:left="400" w:hanging="400"/>
       </w:pPr>
       <w:r>
-        <w:t xml:space="preserve">We ran scripts/analyze_steam.py on the saved records. We checked unique review IDs, valid timestamp order and returned language labels. One record was labelled Simplified Chinese despite the English request. We retained it in the raw archive and a separate exclusion file. The English analysis therefore contains 73,336 reviews. Of those, 13,895, or </w:t>
-      </w:r>
-      <w:proofErr w:type="gramStart"/>
-      <w:r>
-        <w:t>18.9%,</w:t>
-      </w:r>
-      <w:proofErr w:type="gramEnd"/>
-      <w:r>
-        <w:t xml:space="preserve"> have a negative recommendation.</w:t>
+        <w:t xml:space="preserve">We ran scripts/analyze_steam.py on the saved records. We checked unique review IDs, valid timestamp order and returned language labels. One record was labelled Simplified Chinese despite the English request. We retained it in the raw archive and a separate exclusion file. The English analysis therefore contains 73,336 reviews. Of those, 13,895, or 18.9%, have a negative recommendation.</w:t>
       </w:r>
     </w:p>
     <w:p>
@@ -9450,15 +8727,7 @@
         <w:ind w:left="400" w:hanging="400"/>
       </w:pPr>
       <w:r>
-        <w:t xml:space="preserve">We counted word tokens before </w:t>
-      </w:r>
-      <w:proofErr w:type="gramStart"/>
-      <w:r>
-        <w:t>any stop</w:t>
-      </w:r>
-      <w:proofErr w:type="gramEnd"/>
-      <w:r>
-        <w:t xml:space="preserve"> word removal, using consecutive Unicode word characters. Numbers can count as tokens and punctuation can split a word. We found 30,788 English reviews with at least 10 tokens and 42,548 below that limit. We kept both groups. A short review can still name a useful problem. Among the longer reviews, 28,245 had matching creation and latest update timestamps; that is our available check for an unedited record, not a complete edit history.</w:t>
+        <w:t xml:space="preserve">We counted word tokens before any stop word removal, using consecutive Unicode word characters. Numbers can count as tokens and punctuation can split a word. We found 30,788 English reviews with at least 10 tokens and 42,548 below that limit. We kept both groups. A short review can still name a useful problem. Among the longer reviews, 28,245 had matching creation and latest update timestamps; that is our available check for an unedited record, not a complete edit history.</w:t>
       </w:r>
     </w:p>
     <w:p>
@@ -9471,18 +8740,8 @@
       </w:pPr>
       <w:r>
         <w:t xml:space="preserve">We ran scripts/export_balanced.py to select exactly 1,000 reviews per game in two separate exports. Each contains 30,000 rows. reviews_balanced_all.csv uses the newest saved English reviews of any length. reviews_balanced_text.csv uses the newest saved English reviews with at least 10 tokens. Creation time </w:t>
-      </w:r>
-      <w:r>
         <w:lastRenderedPageBreak/>
-        <w:t xml:space="preserve">determines the order and review ID breaks ties. We did not force equal positive and negative counts. The sets can overlap, so </w:t>
-      </w:r>
-      <w:proofErr w:type="gramStart"/>
-      <w:r>
-        <w:t>they</w:t>
-      </w:r>
-      <w:proofErr w:type="gramEnd"/>
-      <w:r>
-        <w:t xml:space="preserve"> are not 60,000 different reviews.</w:t>
+        <w:t xml:space="preserve">determines the order and review ID breaks ties. We did not force equal positive and negative counts. The sets can overlap, so they are not 60,000 different reviews.</w:t>
       </w:r>
     </w:p>
     <w:p>
@@ -9499,6 +8758,7 @@
     </w:p>
     <w:p>
       <w:pPr>
+        <w:keepNext/>
         <w:tabs>
           <w:tab w:val="left" w:pos="400"/>
         </w:tabs>
@@ -9512,19 +8772,8 @@
           <w:i/>
           <w:iCs/>
         </w:rPr>
-        <w:t xml:space="preserve">A5 What the initial analysis </w:t>
-      </w:r>
-      <w:proofErr w:type="gramStart"/>
-      <w:r>
-        <w:rPr>
-          <w:b/>
-          <w:bCs/>
-          <w:i/>
-          <w:iCs/>
-        </w:rPr>
-        <w:t>actually did</w:t>
-      </w:r>
-      <w:proofErr w:type="gramEnd"/>
+        <w:t xml:space="preserve">A5 What the initial analysis actually did</w:t>
+      </w:r>
     </w:p>
     <w:p>
       <w:pPr>
@@ -9547,27 +8796,12 @@
         <w:ind w:left="400" w:hanging="400"/>
       </w:pPr>
       <w:r>
-        <w:t xml:space="preserve">The initial matching used word </w:t>
-      </w:r>
-      <w:proofErr w:type="gramStart"/>
-      <w:r>
-        <w:t>overlap</w:t>
-      </w:r>
-      <w:proofErr w:type="gramEnd"/>
-      <w:r>
-        <w:t xml:space="preserve"> to suggest earlier announcements from the same game for a small set of reviews. It did not train a model or establish that a complaint had been resolved. The phrase audit saved in novelty_feasibility_2026-10-</w:t>
-      </w:r>
-      <w:proofErr w:type="gramStart"/>
-      <w:r>
-        <w:t>15.json</w:t>
-      </w:r>
-      <w:proofErr w:type="gramEnd"/>
-      <w:r>
-        <w:t xml:space="preserve"> found the counts reported in Section 4. We inspected three examples to confirm that different statuses occur; this was not independent human annotation of a test set.</w:t>
-      </w:r>
-    </w:p>
-    <w:p>
-      <w:pPr>
+        <w:t xml:space="preserve">The initial matching used word overlap to suggest earlier announcements from the same game for a small set of reviews. It did not train a model or establish that a complaint had been resolved. The phrase audit saved in novelty_feasibility_2026-10-15.json found the counts reported in Section 4. We inspected three examples to confirm that different statuses occur; this was not independent human annotation of a test set.</w:t>
+      </w:r>
+    </w:p>
+    <w:p>
+      <w:pPr>
+        <w:keepNext/>
         <w:tabs>
           <w:tab w:val="left" w:pos="400"/>
         </w:tabs>
@@ -9605,15 +8839,7 @@
         <w:ind w:left="400" w:hanging="400"/>
       </w:pPr>
       <w:r>
-        <w:t xml:space="preserve">Validation checked that exported review text and recommendations match the saved originals, all 30 games meet the equal caps, and duplicate IDs and profile fields were removed as intended. The saved checks recorded 15 passing tests for waiting, recovery, language checks and balanced exports. A completed rerun made zero HTTP requests. These checks validate collection </w:t>
-      </w:r>
-      <w:proofErr w:type="spellStart"/>
-      <w:r>
-        <w:t>behaviour</w:t>
-      </w:r>
-      <w:proofErr w:type="spellEnd"/>
-      <w:r>
-        <w:t>, not model accuracy.</w:t>
+        <w:t xml:space="preserve">Validation checked that exported review text and recommendations match the saved originals, all 30 games meet the equal caps, and duplicate IDs and profile fields were removed as intended. The saved checks recorded 15 passing tests for waiting, recovery, language checks and balanced exports. A completed rerun made zero HTTP requests. These checks validate collection behaviour, not model accuracy.</w:t>
       </w:r>
     </w:p>
     <w:p>
@@ -9625,15 +8851,7 @@
         <w:ind w:left="400" w:hanging="400"/>
       </w:pPr>
       <w:r>
-        <w:t xml:space="preserve">From the project folder, .\scripts\run_collection.ps1 runs collection, analysis, balanced export and report generation. Running it again resumes saved progress. Increasing </w:t>
-      </w:r>
-      <w:proofErr w:type="spellStart"/>
-      <w:r>
-        <w:t>ReviewsPerGame</w:t>
-      </w:r>
-      <w:proofErr w:type="spellEnd"/>
-      <w:r>
-        <w:t xml:space="preserve"> continues from the saved cursor; a new Snapshot name is needed to collect a fresh set of recent pages.</w:t>
+        <w:t xml:space="preserve">From the project folder, .\scripts\run_collection.ps1 runs collection, analysis, balanced export and report generation. Running it again resumes saved progress. Increasing ReviewsPerGame continues from the saved cursor; a new Snapshot name is needed to collect a fresh set of recent pages.</w:t>
       </w:r>
     </w:p>
     <w:p>

</xml_diff>